<commit_message>
Decision 4 Stata comparison: regenerated at b250f0c (TTP beta0 default 0)
Co-Authored-By: Claude Opus 5.5 (1M context) <noreply@anthropic.com>
</commit_message>
<xml_diff>
--- a/docs/verification/Decision 4 Stata Comparison.docx
+++ b/docs/verification/Decision 4 Stata Comparison.docx
@@ -16,7 +16,7 @@
           <w:b w:val="0"/>
           <w:i/>
         </w:rPr>
-        <w:t>Verification of the COOPECON app (branch migration, HEAD d202e00) against the professor's Decision 4 design document "Decision 4 - Rejected Transaction Defaults 040926-2.docx" and the Stata file Stata_File_Decision4_050926.dta (280 participants). Prepared 2026-10-06 by the migration controller.</w:t>
+        <w:t>Verification of the COOPECON app (branch migration, HEAD b250f0c; the Decision 4 model, config and results are unchanged since d202e00 except the β0 default) against the professor's Decision 4 design document "Decision 4 - Rejected Transaction Defaults 040926-2.docx" and the Stata file Stata_File_Decision4_050926.dta (280 participants). Prepared 2026-10-06 by the migration controller.</w:t>
       </w:r>
     </w:p>
     <w:p>
@@ -321,7 +321,7 @@
               <w:rPr>
                 <w:sz w:val="18"/>
               </w:rPr>
-              <w:t>all 0.0000</w:t>
+              <w:t>all 0.0000 (= app defaults)</w:t>
             </w:r>
           </w:p>
         </w:tc>
@@ -335,7 +335,7 @@
               <w:rPr>
                 <w:sz w:val="18"/>
               </w:rPr>
-              <w:t>the .dta embeds no intercept. App default β0 (Options List Length) = 0.05 must be set to 0 for the Stata comparison (app default kept)</w:t>
+              <w:t>the .dta embeds no intercept; since HEAD ffa32fb the app default β0 (Options List Length, applied on the raw composite) is 0 as well, so the Stata comparison runs at the app defaults</w:t>
             </w:r>
           </w:p>
         </w:tc>
@@ -1503,7 +1503,7 @@
           <w:b w:val="0"/>
           <w:i w:val="0"/>
         </w:rPr>
-        <w:t>Options List Length sub-tab with the intercept override set to 0 (Research Default shows the app default 0.05):</w:t>
+        <w:t>Options List Length sub-tab: intercept override 0 (Research Default 0.0000, the app default):</w:t>
       </w:r>
     </w:p>
     <w:p>
@@ -1513,7 +1513,7 @@
       <w:r>
         <w:drawing>
           <wp:inline xmlns:a="http://schemas.openxmlformats.org/drawingml/2006/main" xmlns:pic="http://schemas.openxmlformats.org/drawingml/2006/picture">
-            <wp:extent cx="5760720" cy="3134185"/>
+            <wp:extent cx="5760720" cy="2923919"/>
             <wp:docPr id="4" name="Picture 4"/>
             <wp:cNvGraphicFramePr>
               <a:graphicFrameLocks noChangeAspect="1"/>
@@ -1534,7 +1534,7 @@
                   <pic:spPr>
                     <a:xfrm>
                       <a:off x="0" y="0"/>
-                      <a:ext cx="5760720" cy="3134185"/>
+                      <a:ext cx="5760720" cy="2923919"/>
                     </a:xfrm>
                     <a:prstGeom prst="rect"/>
                   </pic:spPr>
@@ -2810,7 +2810,7 @@
               <w:rPr>
                 <w:sz w:val="18"/>
               </w:rPr>
-              <w:t>0.078863062 / -0.012326128 / 0.698</w:t>
+              <w:t>0.078863062 / −0.012326128 / 0.698</w:t>
             </w:r>
           </w:p>
         </w:tc>
@@ -2871,7 +2871,7 @@
               <w:rPr>
                 <w:sz w:val="18"/>
               </w:rPr>
-              <w:t>0.025942386297 / 0.023699214948 / -0.038734315188 / -0.037739440732 / -0.025388697852 / 0.006874197106</w:t>
+              <w:t>0.025942386297 / 0.023699214948 / −0.038734315188 / −0.037739440732 / −0.025388697852 / 0.006874197106</w:t>
             </w:r>
           </w:p>
         </w:tc>
@@ -2932,7 +2932,7 @@
               <w:rPr>
                 <w:sz w:val="18"/>
               </w:rPr>
-              <w:t>0.0206 / 0.0294118 / -0.04921357 / 0.04339814 / 0.04811179; W_OFlex 0.25</w:t>
+              <w:t>0.0206 / 0.0294118 / −0.04921357 / 0.04339814 / 0.04811179; W_OFlex 0.25</w:t>
             </w:r>
           </w:p>
         </w:tc>
@@ -3193,7 +3193,7 @@
           <w:b w:val="0"/>
           <w:i w:val="0"/>
         </w:rPr>
-        <w:t>Settings: Research Baseline, 280 agents, β0 = 0 (the app default 0.05 shifts the score by +0.05 and, with the app's fixed-cutoff semantics, the allocation; the Stata file has no intercept). Income specification irrelevant (no income term).</w:t>
+        <w:t>Settings: Research Baseline, 280 agents, β0 = 0 (the app default since HEAD ffa32fb; a non-zero β0 would shift the raw score and, with the app's fixed-cutoff semantics, the allocation; the Stata file has no intercept). Income specification irrelevant (no income term).</w:t>
       </w:r>
     </w:p>
     <w:p>
@@ -3597,7 +3597,7 @@
               <w:rPr>
                 <w:b/>
               </w:rPr>
-              <w:t>App (HEAD d202e00, Chrome capture)</w:t>
+              <w:t>App (HEAD b250f0c, Chrome capture)</w:t>
             </w:r>
           </w:p>
         </w:tc>
@@ -4737,7 +4737,7 @@
               <w:rPr>
                 <w:b/>
               </w:rPr>
-              <w:t>App (HEAD d202e00, Chrome capture)</w:t>
+              <w:t>App (HEAD b250f0c, Chrome capture)</w:t>
             </w:r>
           </w:p>
         </w:tc>
@@ -4878,7 +4878,7 @@
           <w:b/>
           <w:color w:val="1B7F3B"/>
         </w:rPr>
-        <w:t>The values match exactly: weighted_ttp agrees for 280/280 participants (max |diff| 1.8e-08) and choice_length_deterministic for 280/280; the 17-bin histograms and the 0–5 allocation are identical (Stata plots density, the app the proportion).</w:t>
+        <w:t>The values match exactly: weighted_ttp agrees for 280/280 participants (max |diff| 1.8e‑08) and choice_length_deterministic for 280/280; the 17-bin histograms and the 0–5 allocation are identical (Stata plots density, the app the proportion).</w:t>
       </w:r>
     </w:p>
     <w:p>
@@ -5303,7 +5303,7 @@
               <w:rPr>
                 <w:b/>
               </w:rPr>
-              <w:t>App (HEAD d202e00, Chrome capture)</w:t>
+              <w:t>App (HEAD b250f0c, Chrome capture)</w:t>
             </w:r>
           </w:p>
         </w:tc>
@@ -6923,7 +6923,7 @@
               <w:rPr>
                 <w:b/>
               </w:rPr>
-              <w:t>App (HEAD d202e00, Chrome capture)</w:t>
+              <w:t>App (HEAD b250f0c, Chrome capture)</w:t>
             </w:r>
           </w:p>
         </w:tc>
@@ -7064,7 +7064,7 @@
           <w:b/>
           <w:color w:val="1B7F3B"/>
         </w:rPr>
-        <w:t>The values match exactly: weighted_loyalty 280/280 (max |diff| 3.2e-07), weighted_loyalty15 280/280, and the five-position choice lists choice1…choice5_loyalty_deterministic 280/280.</w:t>
+        <w:t>The values match exactly: weighted_loyalty 280/280 (max |diff| 3.2e‑07), weighted_loyalty15 280/280, and the five-position choice lists choice1…choice5_loyalty_deterministic 280/280.</w:t>
       </w:r>
     </w:p>
     <w:p>
@@ -7489,7 +7489,7 @@
               <w:rPr>
                 <w:b/>
               </w:rPr>
-              <w:t>App (HEAD d202e00, Chrome capture)</w:t>
+              <w:t>App (HEAD b250f0c, Chrome capture)</w:t>
             </w:r>
           </w:p>
         </w:tc>
@@ -9096,7 +9096,7 @@
               <w:rPr>
                 <w:b/>
               </w:rPr>
-              <w:t>App (HEAD d202e00, Chrome capture)</w:t>
+              <w:t>App (HEAD b250f0c, Chrome capture)</w:t>
             </w:r>
           </w:p>
         </w:tc>
@@ -9237,7 +9237,7 @@
           <w:b/>
           <w:color w:val="1B7F3B"/>
         </w:rPr>
-        <w:t>The values match exactly: z_WTP_calculated 280/280 (max |diff| 8.1e-06, the .dta stores float32), WTP_calculated15 280/280, choice lists 280/280.</w:t>
+        <w:t>The values match exactly: z_WTP_calculated 280/280 (max |diff| 8.1e‑06, the .dta stores float32), WTP_calculated15 280/280, choice lists 280/280.</w:t>
       </w:r>
     </w:p>
     <w:p>
@@ -9388,7 +9388,7 @@
               <w:rPr>
                 <w:sz w:val="18"/>
               </w:rPr>
-              <w:t>-.691843</w:t>
+              <w:t>−.691843</w:t>
             </w:r>
           </w:p>
         </w:tc>
@@ -9449,7 +9449,7 @@
               <w:rPr>
                 <w:sz w:val="18"/>
               </w:rPr>
-              <w:t>-.691843 + .2671588 = -.4246842</w:t>
+              <w:t>−.691843 + .2671588 = −.4246842</w:t>
             </w:r>
           </w:p>
         </w:tc>
@@ -9510,7 +9510,7 @@
               <w:rPr>
                 <w:sz w:val="18"/>
               </w:rPr>
-              <w:t>-.691843 + .5057716 = -.1860714</w:t>
+              <w:t>−.691843 + .5057716 = −.1860714</w:t>
             </w:r>
           </w:p>
         </w:tc>
@@ -9571,7 +9571,7 @@
               <w:rPr>
                 <w:sz w:val="18"/>
               </w:rPr>
-              <w:t>-.691843 + .9411747 = .2493317</w:t>
+              <w:t>−.691843 + .9411747 = .2493317</w:t>
             </w:r>
           </w:p>
         </w:tc>
@@ -9632,7 +9632,7 @@
               <w:rPr>
                 <w:sz w:val="18"/>
               </w:rPr>
-              <w:t>-.691843 + 1.822471 = 1.130628</w:t>
+              <w:t>−.691843 + 1.822471 = 1.130628</w:t>
             </w:r>
           </w:p>
         </w:tc>
@@ -10538,7 +10538,7 @@
           <w:i w:val="0"/>
           <w:color w:val="8A3B00"/>
         </w:rPr>
-        <w:t>Finding (document / .dta error, not an app defect). The app evaluates the document's printed cond() code exactly (max |diff| 9e-09 against a direct re-computation of that code on the .dta z-columns), but the column weighted_WTP_categorical STORED in Stata_File_Decision4_050926.dta was generated with a superseded version of that command: for allowance levels 2–5 it uses the agreeableness coefficient −0.0123242128 (the value the tracked changes of rev 040926-2 deleted in favour of −0.012326128), and for level 1 (57 participants) a different intercept and coefficient altogether (fitted exactly: −0.7355455 + 0.078863062·zE − 0.0046002694·zA, instead of −0.691843 + 0.078863062·zE − 0.012326128·zA). Consequently the .dta's z_WTP_categorical differs from the document's own formula by up to 0.062 (z-units), its min/max are −1.480752 / 2.029977 versus −1.477873 / 2.046680 for the printed code, and the F7 histogram above is the histogram of the superseded column. The segment allocation differs for exactly 1 of 280 participants (Stata-stored column: 67/101/58/0/54; document code = app: 67/102/57/0/54). The app follows the written document; the professor may want to regenerate the .dta column with the current cond() command.</w:t>
+        <w:t>Finding (document / .dta error, not an app defect). The app evaluates the document's printed cond() code exactly (max |diff| 9e‑09 against a direct re-computation of that code on the .dta z-columns), but the column weighted_WTP_categorical STORED in Stata_File_Decision4_050926.dta was generated with a superseded version of that command: for allowance levels 2–5 it uses the agreeableness coefficient −0.0123242128 (the value the tracked changes of rev 040926-2 deleted in favour of −0.012326128), and for level 1 (57 participants) a different intercept and coefficient altogether (fitted exactly: −0.7355455 + 0.078863062·zE − 0.0046002694·zA, instead of −0.691843 + 0.078863062·zE − 0.012326128·zA). Consequently the .dta's z_WTP_categorical differs from the document's own formula by up to 0.062 (z-units), its min/max are −1.480752 / 2.029977 versus −1.477873 / 2.046680 for the printed code, and the F7 histogram above is the histogram of the superseded column. The segment allocation differs for exactly 1 of 280 participants (Stata-stored column: 67/101/58/0/54; document code = app: 67/102/57/0/54). The app follows the written document; the professor may want to regenerate the .dta column with the current cond() command.</w:t>
       </w:r>
     </w:p>
     <w:tbl>
@@ -11103,7 +11103,7 @@
           <w:b/>
           <w:color w:val="B03A2E"/>
         </w:rPr>
-        <w:t>The coefficients match the document exactly; the app reproduces the document's categorical WTP code to 1e-08. The stored .dta column is the only mismatch (superseded formula in the file, 1 agent's segment).</w:t>
+        <w:t>The coefficients match the document exactly; the app reproduces the document's categorical WTP code to 1e‑08. The stored .dta column is the only mismatch (superseded formula in the file, 1 agent's segment).</w:t>
       </w:r>
     </w:p>
     <w:p>
@@ -11526,7 +11526,7 @@
               <w:rPr>
                 <w:b/>
               </w:rPr>
-              <w:t>App (HEAD d202e00, Chrome capture)</w:t>
+              <w:t>App (HEAD b250f0c, Chrome capture)</w:t>
             </w:r>
           </w:p>
         </w:tc>
@@ -13133,7 +13133,7 @@
               <w:rPr>
                 <w:b/>
               </w:rPr>
-              <w:t>App (HEAD d202e00, Chrome capture)</w:t>
+              <w:t>App (HEAD b250f0c, Chrome capture)</w:t>
             </w:r>
           </w:p>
         </w:tc>
@@ -13274,7 +13274,7 @@
           <w:b/>
           <w:color w:val="1B7F3B"/>
         </w:rPr>
-        <w:t>The values match exactly: z_RT_calculated_hs 280/280 (max |diff| 1.7e-07), RT_calculated15 280/280, choice lists 280/280.</w:t>
+        <w:t>The values match exactly: z_RT_calculated_hs 280/280 (max |diff| 1.7e‑07), RT_calculated15 280/280, choice lists 280/280.</w:t>
       </w:r>
     </w:p>
     <w:p>
@@ -13416,7 +13416,7 @@
               <w:rPr>
                 <w:sz w:val="18"/>
               </w:rPr>
-              <w:t>-.0068307</w:t>
+              <w:t>−.0068307</w:t>
             </w:r>
           </w:p>
         </w:tc>
@@ -13477,7 +13477,7 @@
               <w:rPr>
                 <w:sz w:val="18"/>
               </w:rPr>
-              <w:t>-.0068307 + .0026128 = -.0042179</w:t>
+              <w:t>−.0068307 + .0026128 = −.0042179</w:t>
             </w:r>
           </w:p>
         </w:tc>
@@ -13538,7 +13538,7 @@
               <w:rPr>
                 <w:sz w:val="18"/>
               </w:rPr>
-              <w:t>-.0068307 + .0050555 = -.0017752</w:t>
+              <w:t>−.0068307 + .0050555 = −.0017752</w:t>
             </w:r>
           </w:p>
         </w:tc>
@@ -13599,7 +13599,7 @@
               <w:rPr>
                 <w:sz w:val="18"/>
               </w:rPr>
-              <w:t>-.0068307 + .0092738 = .0024431</w:t>
+              <w:t>−.0068307 + .0092738 = .0024431</w:t>
             </w:r>
           </w:p>
         </w:tc>
@@ -13660,7 +13660,7 @@
               <w:rPr>
                 <w:sz w:val="18"/>
               </w:rPr>
-              <w:t>-.0068307 + .0179812 = .0111505</w:t>
+              <w:t>−.0068307 + .0179812 = .0111505</w:t>
             </w:r>
           </w:p>
         </w:tc>
@@ -15121,7 +15121,7 @@
           <w:b/>
           <w:color w:val="1B7F3B"/>
         </w:rPr>
-        <w:t>The values match exactly: z_RT_categorical 280/280 (max |diff| 2.0e-07); floor-rule segments 280/280.</w:t>
+        <w:t>The values match exactly: z_RT_categorical 280/280 (max |diff| 2.0e‑07); floor-rule segments 280/280.</w:t>
       </w:r>
     </w:p>
     <w:p>
@@ -16015,7 +16015,7 @@
               <w:rPr>
                 <w:b/>
               </w:rPr>
-              <w:t>App (HEAD d202e00, Chrome capture)</w:t>
+              <w:t>App (HEAD b250f0c, Chrome capture)</w:t>
             </w:r>
           </w:p>
         </w:tc>
@@ -17622,7 +17622,7 @@
               <w:rPr>
                 <w:b/>
               </w:rPr>
-              <w:t>App (HEAD d202e00, Chrome capture)</w:t>
+              <w:t>App (HEAD b250f0c, Chrome capture)</w:t>
             </w:r>
           </w:p>
         </w:tc>
@@ -17763,7 +17763,7 @@
           <w:b/>
           <w:color w:val="1B7F3B"/>
         </w:rPr>
-        <w:t>The values match exactly: z_Flexibility_calculated_ivw, z_stdactions and z_anchored_flexibility 280/280 (max |diff| ≤ 2.2e-07), Flexibility_combined15 280/280, choice lists 280/280.</w:t>
+        <w:t>The values match exactly: z_Flexibility_calculated_ivw, z_stdactions and z_anchored_flexibility 280/280 (max |diff| ≤ 2.2e‑07), Flexibility_combined15 280/280, choice lists 280/280.</w:t>
       </w:r>
     </w:p>
     <w:p>

</xml_diff>

<commit_message>
Decision 4 Stata comparison regenerated at f8dff1e: 16-bin density histograms, bar-by-bar verdicts
Co-Authored-By: Claude Opus 5.5 (1M context) <noreply@anthropic.com>
</commit_message>
<xml_diff>
--- a/docs/verification/Decision 4 Stata Comparison.docx
+++ b/docs/verification/Decision 4 Stata Comparison.docx
@@ -16,7 +16,7 @@
           <w:b w:val="0"/>
           <w:i/>
         </w:rPr>
-        <w:t>Verification of the COOPECON app (branch migration, HEAD b250f0c; the Decision 4 model, config and results are unchanged since d202e00 except the β0 default) against the professor's Decision 4 design document "Decision 4 - Rejected Transaction Defaults 040926-2.docx" and the Stata file Stata_File_Decision4_050926.dta (280 participants). Prepared 2026-10-06 by the migration controller.</w:t>
+        <w:t>Verification of the COOPECON app (branch migration, HEAD f8dff1e) against the professor's Decision 4 design document "Decision 4 - Rejected Transaction Defaults 040926-2.docx" and the Stata file Stata_File_Decision4_050926.dta (280 participants). Prepared 2026-10-07 by the migration controller; every figure pair was checked bar by bar (bar count, bin edges and bar heights of the app chart against the histogram of the .dta column at the document's bin count; discrete charts against the value counts) – see the per-figure table in Appendix A.</w:t>
       </w:r>
     </w:p>
     <w:p>
@@ -147,7 +147,7 @@
               <w:rPr>
                 <w:sz w:val="18"/>
               </w:rPr>
-              <w:t>the original 280 participants, no stochastic component (Stata: the 280 observations)</w:t>
+              <w:t>the original 280 participants, no stochastic component (Stata: the 280 observations). Both research modes use the 280 participants in file order: agent k = participant k mod 280 (N = 280 → exactly the file; N = 1000 → three full cycles plus the first 160; N &lt; 280 → the first N); no bootstrap or permutation (owner ruling, HEAD e0d3d97)</w:t>
             </w:r>
           </w:p>
         </w:tc>
@@ -194,7 +194,7 @@
               <w:rPr>
                 <w:sz w:val="18"/>
               </w:rPr>
-              <w:t>N ≤ 280 → the first 280 original rows in order, no random draw; seed irrelevant (42 used)</w:t>
+              <w:t>the Stata file has 280 observations; with the default 1000 the first 160 participants would be counted four times and the min-max segment statistics would shift slightly; seed irrelevant in the research modes (42 used)</w:t>
             </w:r>
           </w:p>
         </w:tc>
@@ -321,7 +321,7 @@
               <w:rPr>
                 <w:sz w:val="18"/>
               </w:rPr>
-              <w:t>all 0.0000 (= app defaults)</w:t>
+              <w:t>all 0.0000 (= app defaults, config/decisions.yaml)</w:t>
             </w:r>
           </w:p>
         </w:tc>
@@ -335,7 +335,7 @@
               <w:rPr>
                 <w:sz w:val="18"/>
               </w:rPr>
-              <w:t>the .dta embeds no intercept; since HEAD ffa32fb the app default β0 (Options List Length, applied on the raw composite) is 0 as well, so the Stata comparison runs at the app defaults</w:t>
+              <w:t>the .dta embeds no intercept; the app default β0 (Options List Length, applied on the raw composite, override range −0.25 … 0.25) is 0 (owner ruling 2026-10-07), so the Stata comparison runs at the app defaults</w:t>
             </w:r>
           </w:p>
         </w:tc>
@@ -462,7 +462,7 @@
               <w:rPr>
                 <w:sz w:val="18"/>
               </w:rPr>
-              <w:t>Stata default rule min(√N, 10·log10 N) → 17 bins at N = 280</w:t>
+              <w:t>Stata default rule k = trunc(min(√N, 10·log10 N)) → 16 bins at N = 280</w:t>
             </w:r>
           </w:p>
         </w:tc>
@@ -476,7 +476,7 @@
               <w:rPr>
                 <w:sz w:val="18"/>
               </w:rPr>
-              <w:t>the app applies the same rule (capped at 17); Stata plots density, the app plots the proportion of agents – identical shapes, y-axis scaled by the bin width</w:t>
+              <w:t>verified on the document's figures: every one of the 11 continuous histograms reproduces np.histogram(.dta column, bins = 16) bar for bar (max relative bar error ≤ 0.5 %; 17 bins give 19–40 % errors). The app applies the same truncating rule (capped at 16; HEAD e41968d – until then it rounded to 17) and, since HEAD 0c46d6d, plots DENSITY (count / (N × bin width)) like Stata, so the side-by-side charts have the same bars, edges and heights</w:t>
             </w:r>
           </w:p>
         </w:tc>
@@ -746,7 +746,7 @@
               <w:rPr>
                 <w:sz w:val="18"/>
               </w:rPr>
-              <w:t>Match – 280/280 agents (β0 = 0)</w:t>
+              <w:t>Match – 280/280 agents (β0 = 0); figures identical bar by bar</w:t>
             </w:r>
           </w:p>
         </w:tc>
@@ -807,7 +807,7 @@
               <w:rPr>
                 <w:sz w:val="18"/>
               </w:rPr>
-              <w:t>Match – 280/280 (score, segment, 5-option list)</w:t>
+              <w:t>Match – 280/280 (score, segment, 5-option list); figures identical bar by bar</w:t>
             </w:r>
           </w:p>
         </w:tc>
@@ -868,7 +868,7 @@
               <w:rPr>
                 <w:sz w:val="18"/>
               </w:rPr>
-              <w:t>Match – 280/280</w:t>
+              <w:t>Match – 280/280; figures identical bar by bar</w:t>
             </w:r>
           </w:p>
         </w:tc>
@@ -929,7 +929,7 @@
               <w:rPr>
                 <w:sz w:val="18"/>
               </w:rPr>
-              <w:t>Coefficients match; the .dta's stored weighted_WTP_categorical was generated with a superseded formula (see step 6) – the app reproduces the document's printed code; 1 agent's segment differs from the .dta</w:t>
+              <w:t>Coefficients match; F7 DOES NOT MATCH the app chart (max bar difference 25 % of the tallest bar): the .dta's stored weighted_WTP_categorical was generated with a superseded formula (see step 6) – the app reproduces the document's printed code; 1 agent's segment differs from the .dta</w:t>
             </w:r>
           </w:p>
         </w:tc>
@@ -990,7 +990,7 @@
               <w:rPr>
                 <w:sz w:val="18"/>
               </w:rPr>
-              <w:t>Match – 280/280</w:t>
+              <w:t>Match – 280/280; figures identical bar by bar</w:t>
             </w:r>
           </w:p>
         </w:tc>
@@ -1051,7 +1051,7 @@
               <w:rPr>
                 <w:sz w:val="18"/>
               </w:rPr>
-              <w:t>Match – 280/280 (z-score and floor-rule segments)</w:t>
+              <w:t>Match – 280/280 (z-score and floor-rule segments); F11 identical bar by bar</w:t>
             </w:r>
           </w:p>
         </w:tc>
@@ -1112,7 +1112,7 @@
               <w:rPr>
                 <w:sz w:val="18"/>
               </w:rPr>
-              <w:t>Match – 280/280</w:t>
+              <w:t>Match – 280/280; F15/F16 identical bar by bar (F13/F14 have no app chart: columns 280/280)</w:t>
             </w:r>
           </w:p>
         </w:tc>
@@ -1426,7 +1426,7 @@
       <w:r>
         <w:drawing>
           <wp:inline xmlns:a="http://schemas.openxmlformats.org/drawingml/2006/main" xmlns:pic="http://schemas.openxmlformats.org/drawingml/2006/picture">
-            <wp:extent cx="5760720" cy="3134185"/>
+            <wp:extent cx="5760720" cy="3135191"/>
             <wp:docPr id="2" name="Picture 2"/>
             <wp:cNvGraphicFramePr>
               <a:graphicFrameLocks noChangeAspect="1"/>
@@ -1447,7 +1447,7 @@
                   <pic:spPr>
                     <a:xfrm>
                       <a:off x="0" y="0"/>
-                      <a:ext cx="5760720" cy="3134185"/>
+                      <a:ext cx="5760720" cy="3135191"/>
                     </a:xfrm>
                     <a:prstGeom prst="rect"/>
                   </pic:spPr>
@@ -3578,6 +3578,9 @@
             <w:tcW w:type="dxa" w:w="4968"/>
           </w:tcPr>
           <w:p>
+            <w:pPr>
+              <w:keepNext/>
+            </w:pPr>
             <w:r/>
             <w:r>
               <w:rPr>
@@ -3592,12 +3595,15 @@
             <w:tcW w:type="dxa" w:w="4968"/>
           </w:tcPr>
           <w:p>
+            <w:pPr>
+              <w:keepNext/>
+            </w:pPr>
             <w:r/>
             <w:r>
               <w:rPr>
                 <w:b/>
               </w:rPr>
-              <w:t>App (HEAD b250f0c, Chrome capture)</w:t>
+              <w:t>App (HEAD f8dff1e, Chrome capture)</w:t>
             </w:r>
           </w:p>
         </w:tc>
@@ -3657,7 +3663,7 @@
             <w:r>
               <w:drawing>
                 <wp:inline xmlns:a="http://schemas.openxmlformats.org/drawingml/2006/main" xmlns:pic="http://schemas.openxmlformats.org/drawingml/2006/picture">
-                  <wp:extent cx="3017520" cy="1408176"/>
+                  <wp:extent cx="3017520" cy="2201974"/>
                   <wp:docPr id="10" name="Picture 10"/>
                   <wp:cNvGraphicFramePr>
                     <a:graphicFrameLocks noChangeAspect="1"/>
@@ -3678,7 +3684,7 @@
                         <pic:spPr>
                           <a:xfrm>
                             <a:off x="0" y="0"/>
-                            <a:ext cx="3017520" cy="1408176"/>
+                            <a:ext cx="3017520" cy="2201974"/>
                           </a:xfrm>
                           <a:prstGeom prst="rect"/>
                         </pic:spPr>
@@ -4718,6 +4724,9 @@
             <w:tcW w:type="dxa" w:w="4968"/>
           </w:tcPr>
           <w:p>
+            <w:pPr>
+              <w:keepNext/>
+            </w:pPr>
             <w:r/>
             <w:r>
               <w:rPr>
@@ -4732,12 +4741,15 @@
             <w:tcW w:type="dxa" w:w="4968"/>
           </w:tcPr>
           <w:p>
+            <w:pPr>
+              <w:keepNext/>
+            </w:pPr>
             <w:r/>
             <w:r>
               <w:rPr>
                 <w:b/>
               </w:rPr>
-              <w:t>App (HEAD b250f0c, Chrome capture)</w:t>
+              <w:t>App (HEAD f8dff1e, Chrome capture)</w:t>
             </w:r>
           </w:p>
         </w:tc>
@@ -4797,7 +4809,7 @@
             <w:r>
               <w:drawing>
                 <wp:inline xmlns:a="http://schemas.openxmlformats.org/drawingml/2006/main" xmlns:pic="http://schemas.openxmlformats.org/drawingml/2006/picture">
-                  <wp:extent cx="3017520" cy="1408176"/>
+                  <wp:extent cx="3017520" cy="2201974"/>
                   <wp:docPr id="12" name="Picture 12"/>
                   <wp:cNvGraphicFramePr>
                     <a:graphicFrameLocks noChangeAspect="1"/>
@@ -4818,7 +4830,7 @@
                         <pic:spPr>
                           <a:xfrm>
                             <a:off x="0" y="0"/>
-                            <a:ext cx="3017520" cy="1408176"/>
+                            <a:ext cx="3017520" cy="2201974"/>
                           </a:xfrm>
                           <a:prstGeom prst="rect"/>
                         </pic:spPr>
@@ -4840,7 +4852,7 @@
       <w:r>
         <w:drawing>
           <wp:inline xmlns:a="http://schemas.openxmlformats.org/drawingml/2006/main" xmlns:pic="http://schemas.openxmlformats.org/drawingml/2006/picture">
-            <wp:extent cx="5760720" cy="3134185"/>
+            <wp:extent cx="5760720" cy="3135191"/>
             <wp:docPr id="13" name="Picture 13"/>
             <wp:cNvGraphicFramePr>
               <a:graphicFrameLocks noChangeAspect="1"/>
@@ -4861,7 +4873,7 @@
                   <pic:spPr>
                     <a:xfrm>
                       <a:off x="0" y="0"/>
-                      <a:ext cx="5760720" cy="3134185"/>
+                      <a:ext cx="5760720" cy="3135191"/>
                     </a:xfrm>
                     <a:prstGeom prst="rect"/>
                   </pic:spPr>
@@ -4878,7 +4890,7 @@
           <w:b/>
           <w:color w:val="1B7F3B"/>
         </w:rPr>
-        <w:t>The values match exactly: weighted_ttp agrees for 280/280 participants (max |diff| 1.8e‑08) and choice_length_deterministic for 280/280; the 17-bin histograms and the 0–5 allocation are identical (Stata plots density, the app the proportion).</w:t>
+        <w:t>The values match exactly: weighted_ttp agrees for 280/280 participants (max |diff| 1.8e‑08) and choice_length_deterministic for 280/280. Figures bar by bar – F1: 16 bars vs 16 in the Stata figure, bin edges equal to 7.7e‑09, max bar-height difference 3.6e‑08 density units (0.000 % of the tallest bar); F2: 6 bars vs 6, max bar-height difference 0.000 percentage points. Both charts plot the same quantity as Stata (density / % of agents).</w:t>
       </w:r>
     </w:p>
     <w:p>
@@ -5284,6 +5296,9 @@
             <w:tcW w:type="dxa" w:w="4968"/>
           </w:tcPr>
           <w:p>
+            <w:pPr>
+              <w:keepNext/>
+            </w:pPr>
             <w:r/>
             <w:r>
               <w:rPr>
@@ -5298,12 +5313,15 @@
             <w:tcW w:type="dxa" w:w="4968"/>
           </w:tcPr>
           <w:p>
+            <w:pPr>
+              <w:keepNext/>
+            </w:pPr>
             <w:r/>
             <w:r>
               <w:rPr>
                 <w:b/>
               </w:rPr>
-              <w:t>App (HEAD b250f0c, Chrome capture)</w:t>
+              <w:t>App (HEAD f8dff1e, Chrome capture)</w:t>
             </w:r>
           </w:p>
         </w:tc>
@@ -5363,7 +5381,7 @@
             <w:r>
               <w:drawing>
                 <wp:inline xmlns:a="http://schemas.openxmlformats.org/drawingml/2006/main" xmlns:pic="http://schemas.openxmlformats.org/drawingml/2006/picture">
-                  <wp:extent cx="3017520" cy="1408176"/>
+                  <wp:extent cx="3017520" cy="2201974"/>
                   <wp:docPr id="15" name="Picture 15"/>
                   <wp:cNvGraphicFramePr>
                     <a:graphicFrameLocks noChangeAspect="1"/>
@@ -5384,7 +5402,7 @@
                         <pic:spPr>
                           <a:xfrm>
                             <a:off x="0" y="0"/>
-                            <a:ext cx="3017520" cy="1408176"/>
+                            <a:ext cx="3017520" cy="2201974"/>
                           </a:xfrm>
                           <a:prstGeom prst="rect"/>
                         </pic:spPr>
@@ -6904,6 +6922,9 @@
             <w:tcW w:type="dxa" w:w="4968"/>
           </w:tcPr>
           <w:p>
+            <w:pPr>
+              <w:keepNext/>
+            </w:pPr>
             <w:r/>
             <w:r>
               <w:rPr>
@@ -6918,12 +6939,15 @@
             <w:tcW w:type="dxa" w:w="4968"/>
           </w:tcPr>
           <w:p>
+            <w:pPr>
+              <w:keepNext/>
+            </w:pPr>
             <w:r/>
             <w:r>
               <w:rPr>
                 <w:b/>
               </w:rPr>
-              <w:t>App (HEAD b250f0c, Chrome capture)</w:t>
+              <w:t>App (HEAD f8dff1e, Chrome capture)</w:t>
             </w:r>
           </w:p>
         </w:tc>
@@ -6983,7 +7007,7 @@
             <w:r>
               <w:drawing>
                 <wp:inline xmlns:a="http://schemas.openxmlformats.org/drawingml/2006/main" xmlns:pic="http://schemas.openxmlformats.org/drawingml/2006/picture">
-                  <wp:extent cx="3017520" cy="1408176"/>
+                  <wp:extent cx="3017520" cy="2201974"/>
                   <wp:docPr id="17" name="Picture 17"/>
                   <wp:cNvGraphicFramePr>
                     <a:graphicFrameLocks noChangeAspect="1"/>
@@ -7004,7 +7028,7 @@
                         <pic:spPr>
                           <a:xfrm>
                             <a:off x="0" y="0"/>
-                            <a:ext cx="3017520" cy="1408176"/>
+                            <a:ext cx="3017520" cy="2201974"/>
                           </a:xfrm>
                           <a:prstGeom prst="rect"/>
                         </pic:spPr>
@@ -7026,7 +7050,7 @@
       <w:r>
         <w:drawing>
           <wp:inline xmlns:a="http://schemas.openxmlformats.org/drawingml/2006/main" xmlns:pic="http://schemas.openxmlformats.org/drawingml/2006/picture">
-            <wp:extent cx="5760720" cy="3134185"/>
+            <wp:extent cx="5760720" cy="3135191"/>
             <wp:docPr id="18" name="Picture 18"/>
             <wp:cNvGraphicFramePr>
               <a:graphicFrameLocks noChangeAspect="1"/>
@@ -7047,7 +7071,7 @@
                   <pic:spPr>
                     <a:xfrm>
                       <a:off x="0" y="0"/>
-                      <a:ext cx="5760720" cy="3134185"/>
+                      <a:ext cx="5760720" cy="3135191"/>
                     </a:xfrm>
                     <a:prstGeom prst="rect"/>
                   </pic:spPr>
@@ -7064,7 +7088,7 @@
           <w:b/>
           <w:color w:val="1B7F3B"/>
         </w:rPr>
-        <w:t>The values match exactly: weighted_loyalty 280/280 (max |diff| 3.2e‑07), weighted_loyalty15 280/280, and the five-position choice lists choice1…choice5_loyalty_deterministic 280/280.</w:t>
+        <w:t>The values match exactly: weighted_loyalty 280/280 (max |diff| 3.2e‑07), weighted_loyalty15 280/280, and the five-position choice lists choice1…choice5_loyalty_deterministic 280/280. Figures bar by bar – F3: 16 bars vs 16 in the Stata figure, bin edges equal to 7.2e‑08, max bar-height difference 2.6e‑09 density units (0.000 % of the tallest bar); F4 (segments 1…5 ↔ first options 2, 5, 4, 1, 3): 5 bars vs 5, max bar-height difference 0.000 percentage points.</w:t>
       </w:r>
     </w:p>
     <w:p>
@@ -7470,6 +7494,9 @@
             <w:tcW w:type="dxa" w:w="4968"/>
           </w:tcPr>
           <w:p>
+            <w:pPr>
+              <w:keepNext/>
+            </w:pPr>
             <w:r/>
             <w:r>
               <w:rPr>
@@ -7484,12 +7511,15 @@
             <w:tcW w:type="dxa" w:w="4968"/>
           </w:tcPr>
           <w:p>
+            <w:pPr>
+              <w:keepNext/>
+            </w:pPr>
             <w:r/>
             <w:r>
               <w:rPr>
                 <w:b/>
               </w:rPr>
-              <w:t>App (HEAD b250f0c, Chrome capture)</w:t>
+              <w:t>App (HEAD f8dff1e, Chrome capture)</w:t>
             </w:r>
           </w:p>
         </w:tc>
@@ -7549,7 +7579,7 @@
             <w:r>
               <w:drawing>
                 <wp:inline xmlns:a="http://schemas.openxmlformats.org/drawingml/2006/main" xmlns:pic="http://schemas.openxmlformats.org/drawingml/2006/picture">
-                  <wp:extent cx="3017520" cy="1408176"/>
+                  <wp:extent cx="3017520" cy="2201974"/>
                   <wp:docPr id="20" name="Picture 20"/>
                   <wp:cNvGraphicFramePr>
                     <a:graphicFrameLocks noChangeAspect="1"/>
@@ -7570,7 +7600,7 @@
                         <pic:spPr>
                           <a:xfrm>
                             <a:off x="0" y="0"/>
-                            <a:ext cx="3017520" cy="1408176"/>
+                            <a:ext cx="3017520" cy="2201974"/>
                           </a:xfrm>
                           <a:prstGeom prst="rect"/>
                         </pic:spPr>
@@ -9077,6 +9107,9 @@
             <w:tcW w:type="dxa" w:w="4968"/>
           </w:tcPr>
           <w:p>
+            <w:pPr>
+              <w:keepNext/>
+            </w:pPr>
             <w:r/>
             <w:r>
               <w:rPr>
@@ -9091,12 +9124,15 @@
             <w:tcW w:type="dxa" w:w="4968"/>
           </w:tcPr>
           <w:p>
+            <w:pPr>
+              <w:keepNext/>
+            </w:pPr>
             <w:r/>
             <w:r>
               <w:rPr>
                 <w:b/>
               </w:rPr>
-              <w:t>App (HEAD b250f0c, Chrome capture)</w:t>
+              <w:t>App (HEAD f8dff1e, Chrome capture)</w:t>
             </w:r>
           </w:p>
         </w:tc>
@@ -9156,7 +9192,7 @@
             <w:r>
               <w:drawing>
                 <wp:inline xmlns:a="http://schemas.openxmlformats.org/drawingml/2006/main" xmlns:pic="http://schemas.openxmlformats.org/drawingml/2006/picture">
-                  <wp:extent cx="3017520" cy="1408176"/>
+                  <wp:extent cx="3017520" cy="2201974"/>
                   <wp:docPr id="22" name="Picture 22"/>
                   <wp:cNvGraphicFramePr>
                     <a:graphicFrameLocks noChangeAspect="1"/>
@@ -9177,7 +9213,7 @@
                         <pic:spPr>
                           <a:xfrm>
                             <a:off x="0" y="0"/>
-                            <a:ext cx="3017520" cy="1408176"/>
+                            <a:ext cx="3017520" cy="2201974"/>
                           </a:xfrm>
                           <a:prstGeom prst="rect"/>
                         </pic:spPr>
@@ -9199,7 +9235,7 @@
       <w:r>
         <w:drawing>
           <wp:inline xmlns:a="http://schemas.openxmlformats.org/drawingml/2006/main" xmlns:pic="http://schemas.openxmlformats.org/drawingml/2006/picture">
-            <wp:extent cx="5760720" cy="3134185"/>
+            <wp:extent cx="5760720" cy="3135191"/>
             <wp:docPr id="23" name="Picture 23"/>
             <wp:cNvGraphicFramePr>
               <a:graphicFrameLocks noChangeAspect="1"/>
@@ -9220,7 +9256,7 @@
                   <pic:spPr>
                     <a:xfrm>
                       <a:off x="0" y="0"/>
-                      <a:ext cx="5760720" cy="3134185"/>
+                      <a:ext cx="5760720" cy="3135191"/>
                     </a:xfrm>
                     <a:prstGeom prst="rect"/>
                   </pic:spPr>
@@ -9237,7 +9273,7 @@
           <w:b/>
           <w:color w:val="1B7F3B"/>
         </w:rPr>
-        <w:t>The values match exactly: z_WTP_calculated 280/280 (max |diff| 8.1e‑06, the .dta stores float32), WTP_calculated15 280/280, choice lists 280/280.</w:t>
+        <w:t>The values match exactly: z_WTP_calculated 280/280 (max |diff| 8.1e‑06, the .dta stores float32), WTP_calculated15 280/280, choice lists 280/280. Figures bar by bar – F6: 16 bars vs 16 in the Stata figure, bin edges equal to 3.9e‑06, max bar-height difference 5.8e‑07 density units (0.000 % of the tallest bar); F8: 5 bars vs 5, max bar-height difference 0.000 percentage points.</w:t>
       </w:r>
     </w:p>
     <w:p>
@@ -9734,6 +9770,9 @@
             <w:tcW w:type="dxa" w:w="4968"/>
           </w:tcPr>
           <w:p>
+            <w:pPr>
+              <w:keepNext/>
+            </w:pPr>
             <w:r/>
             <w:r>
               <w:rPr>
@@ -9748,6 +9787,9 @@
             <w:tcW w:type="dxa" w:w="4968"/>
           </w:tcPr>
           <w:p>
+            <w:pPr>
+              <w:keepNext/>
+            </w:pPr>
             <w:r/>
             <w:r>
               <w:rPr>
@@ -9905,7 +9947,7 @@
             <w:r>
               <w:drawing>
                 <wp:inline xmlns:a="http://schemas.openxmlformats.org/drawingml/2006/main" xmlns:pic="http://schemas.openxmlformats.org/drawingml/2006/picture">
-                  <wp:extent cx="3017520" cy="1408176"/>
+                  <wp:extent cx="3017520" cy="2201974"/>
                   <wp:docPr id="27" name="Picture 27"/>
                   <wp:cNvGraphicFramePr>
                     <a:graphicFrameLocks noChangeAspect="1"/>
@@ -9926,7 +9968,7 @@
                         <pic:spPr>
                           <a:xfrm>
                             <a:off x="0" y="0"/>
-                            <a:ext cx="3017520" cy="1408176"/>
+                            <a:ext cx="3017520" cy="2201974"/>
                           </a:xfrm>
                           <a:prstGeom prst="rect"/>
                         </pic:spPr>
@@ -9947,7 +9989,7 @@
             <w:r>
               <w:drawing>
                 <wp:inline xmlns:a="http://schemas.openxmlformats.org/drawingml/2006/main" xmlns:pic="http://schemas.openxmlformats.org/drawingml/2006/picture">
-                  <wp:extent cx="3017520" cy="1408176"/>
+                  <wp:extent cx="3017520" cy="2201974"/>
                   <wp:docPr id="28" name="Picture 28"/>
                   <wp:cNvGraphicFramePr>
                     <a:graphicFrameLocks noChangeAspect="1"/>
@@ -9968,7 +10010,7 @@
                         <pic:spPr>
                           <a:xfrm>
                             <a:off x="0" y="0"/>
-                            <a:ext cx="3017520" cy="1408176"/>
+                            <a:ext cx="3017520" cy="2201974"/>
                           </a:xfrm>
                           <a:prstGeom prst="rect"/>
                         </pic:spPr>
@@ -9990,7 +10032,7 @@
       <w:r>
         <w:drawing>
           <wp:inline xmlns:a="http://schemas.openxmlformats.org/drawingml/2006/main" xmlns:pic="http://schemas.openxmlformats.org/drawingml/2006/picture">
-            <wp:extent cx="5760720" cy="3134185"/>
+            <wp:extent cx="5760720" cy="3135191"/>
             <wp:docPr id="29" name="Picture 29"/>
             <wp:cNvGraphicFramePr>
               <a:graphicFrameLocks noChangeAspect="1"/>
@@ -10011,7 +10053,7 @@
                   <pic:spPr>
                     <a:xfrm>
                       <a:off x="0" y="0"/>
-                      <a:ext cx="5760720" cy="3134185"/>
+                      <a:ext cx="5760720" cy="3135191"/>
                     </a:xfrm>
                     <a:prstGeom prst="rect"/>
                   </pic:spPr>
@@ -11103,7 +11145,7 @@
           <w:b/>
           <w:color w:val="B03A2E"/>
         </w:rPr>
-        <w:t>The coefficients match the document exactly; the app reproduces the document's categorical WTP code to 1e‑08. The stored .dta column is the only mismatch (superseded formula in the file, 1 agent's segment).</w:t>
+        <w:t>DOES NOT MATCH visually: Stata F7 vs the app's categorical WTP score – 16 bars vs 16 in the Stata figure, bin edges equal to 1.7e‑02, max bar-height difference 1.6e‑01 density units (24.686 % of the tallest bar). Reason: F7 is the histogram of the .dta's stored z_WTP_categorical, which was generated with the superseded cond() formula described above (different level-1 intercept/coefficient and the old −0.0123242128 agreeableness weight), so its bar heights differ from the histogram of the document's printed code, which the app reproduces to 1e‑08. The derived segment chart differs for exactly 1 of 280 agents (5 bars vs 5, max bar-height difference 0.357 percentage points). The coefficients and the app's computation match the document exactly; the stored .dta column is the only mismatch.</w:t>
       </w:r>
     </w:p>
     <w:p>
@@ -11507,6 +11549,9 @@
             <w:tcW w:type="dxa" w:w="4968"/>
           </w:tcPr>
           <w:p>
+            <w:pPr>
+              <w:keepNext/>
+            </w:pPr>
             <w:r/>
             <w:r>
               <w:rPr>
@@ -11521,12 +11566,15 @@
             <w:tcW w:type="dxa" w:w="4968"/>
           </w:tcPr>
           <w:p>
+            <w:pPr>
+              <w:keepNext/>
+            </w:pPr>
             <w:r/>
             <w:r>
               <w:rPr>
                 <w:b/>
               </w:rPr>
-              <w:t>App (HEAD b250f0c, Chrome capture)</w:t>
+              <w:t>App (HEAD f8dff1e, Chrome capture)</w:t>
             </w:r>
           </w:p>
         </w:tc>
@@ -11586,7 +11634,7 @@
             <w:r>
               <w:drawing>
                 <wp:inline xmlns:a="http://schemas.openxmlformats.org/drawingml/2006/main" xmlns:pic="http://schemas.openxmlformats.org/drawingml/2006/picture">
-                  <wp:extent cx="3017520" cy="1408176"/>
+                  <wp:extent cx="3017520" cy="2201974"/>
                   <wp:docPr id="31" name="Picture 31"/>
                   <wp:cNvGraphicFramePr>
                     <a:graphicFrameLocks noChangeAspect="1"/>
@@ -11607,7 +11655,7 @@
                         <pic:spPr>
                           <a:xfrm>
                             <a:off x="0" y="0"/>
-                            <a:ext cx="3017520" cy="1408176"/>
+                            <a:ext cx="3017520" cy="2201974"/>
                           </a:xfrm>
                           <a:prstGeom prst="rect"/>
                         </pic:spPr>
@@ -13114,6 +13162,9 @@
             <w:tcW w:type="dxa" w:w="4968"/>
           </w:tcPr>
           <w:p>
+            <w:pPr>
+              <w:keepNext/>
+            </w:pPr>
             <w:r/>
             <w:r>
               <w:rPr>
@@ -13128,12 +13179,15 @@
             <w:tcW w:type="dxa" w:w="4968"/>
           </w:tcPr>
           <w:p>
+            <w:pPr>
+              <w:keepNext/>
+            </w:pPr>
             <w:r/>
             <w:r>
               <w:rPr>
                 <w:b/>
               </w:rPr>
-              <w:t>App (HEAD b250f0c, Chrome capture)</w:t>
+              <w:t>App (HEAD f8dff1e, Chrome capture)</w:t>
             </w:r>
           </w:p>
         </w:tc>
@@ -13193,7 +13247,7 @@
             <w:r>
               <w:drawing>
                 <wp:inline xmlns:a="http://schemas.openxmlformats.org/drawingml/2006/main" xmlns:pic="http://schemas.openxmlformats.org/drawingml/2006/picture">
-                  <wp:extent cx="3017520" cy="1408176"/>
+                  <wp:extent cx="3017520" cy="2201974"/>
                   <wp:docPr id="33" name="Picture 33"/>
                   <wp:cNvGraphicFramePr>
                     <a:graphicFrameLocks noChangeAspect="1"/>
@@ -13214,7 +13268,7 @@
                         <pic:spPr>
                           <a:xfrm>
                             <a:off x="0" y="0"/>
-                            <a:ext cx="3017520" cy="1408176"/>
+                            <a:ext cx="3017520" cy="2201974"/>
                           </a:xfrm>
                           <a:prstGeom prst="rect"/>
                         </pic:spPr>
@@ -13236,7 +13290,7 @@
       <w:r>
         <w:drawing>
           <wp:inline xmlns:a="http://schemas.openxmlformats.org/drawingml/2006/main" xmlns:pic="http://schemas.openxmlformats.org/drawingml/2006/picture">
-            <wp:extent cx="5760720" cy="3134185"/>
+            <wp:extent cx="5760720" cy="3135191"/>
             <wp:docPr id="34" name="Picture 34"/>
             <wp:cNvGraphicFramePr>
               <a:graphicFrameLocks noChangeAspect="1"/>
@@ -13257,7 +13311,7 @@
                   <pic:spPr>
                     <a:xfrm>
                       <a:off x="0" y="0"/>
-                      <a:ext cx="5760720" cy="3134185"/>
+                      <a:ext cx="5760720" cy="3135191"/>
                     </a:xfrm>
                     <a:prstGeom prst="rect"/>
                   </pic:spPr>
@@ -13274,7 +13328,7 @@
           <w:b/>
           <w:color w:val="1B7F3B"/>
         </w:rPr>
-        <w:t>The values match exactly: z_RT_calculated_hs 280/280 (max |diff| 1.7e‑07), RT_calculated15 280/280, choice lists 280/280.</w:t>
+        <w:t>The values match exactly: z_RT_calculated_hs 280/280 (max |diff| 1.7e‑07), RT_calculated15 280/280, choice lists 280/280. Figures bar by bar – F9: 16 bars vs 16 in the Stata figure, bin edges equal to 7.4e‑08, max bar-height difference 1.3e‑09 density units (0.000 % of the tallest bar); F12: 5 bars vs 5, max bar-height difference 0.000 percentage points.</w:t>
       </w:r>
     </w:p>
     <w:p>
@@ -13753,6 +13807,9 @@
             <w:tcW w:type="dxa" w:w="4968"/>
           </w:tcPr>
           <w:p>
+            <w:pPr>
+              <w:keepNext/>
+            </w:pPr>
             <w:r/>
             <w:r>
               <w:rPr>
@@ -13767,6 +13824,9 @@
             <w:tcW w:type="dxa" w:w="4968"/>
           </w:tcPr>
           <w:p>
+            <w:pPr>
+              <w:keepNext/>
+            </w:pPr>
             <w:r/>
             <w:r>
               <w:rPr>
@@ -13924,7 +13984,7 @@
             <w:r>
               <w:drawing>
                 <wp:inline xmlns:a="http://schemas.openxmlformats.org/drawingml/2006/main" xmlns:pic="http://schemas.openxmlformats.org/drawingml/2006/picture">
-                  <wp:extent cx="3017520" cy="1408176"/>
+                  <wp:extent cx="3017520" cy="2201974"/>
                   <wp:docPr id="38" name="Picture 38"/>
                   <wp:cNvGraphicFramePr>
                     <a:graphicFrameLocks noChangeAspect="1"/>
@@ -13945,7 +14005,7 @@
                         <pic:spPr>
                           <a:xfrm>
                             <a:off x="0" y="0"/>
-                            <a:ext cx="3017520" cy="1408176"/>
+                            <a:ext cx="3017520" cy="2201974"/>
                           </a:xfrm>
                           <a:prstGeom prst="rect"/>
                         </pic:spPr>
@@ -13966,7 +14026,7 @@
             <w:r>
               <w:drawing>
                 <wp:inline xmlns:a="http://schemas.openxmlformats.org/drawingml/2006/main" xmlns:pic="http://schemas.openxmlformats.org/drawingml/2006/picture">
-                  <wp:extent cx="3017520" cy="1408176"/>
+                  <wp:extent cx="3017520" cy="2201974"/>
                   <wp:docPr id="39" name="Picture 39"/>
                   <wp:cNvGraphicFramePr>
                     <a:graphicFrameLocks noChangeAspect="1"/>
@@ -13987,7 +14047,7 @@
                         <pic:spPr>
                           <a:xfrm>
                             <a:off x="0" y="0"/>
-                            <a:ext cx="3017520" cy="1408176"/>
+                            <a:ext cx="3017520" cy="2201974"/>
                           </a:xfrm>
                           <a:prstGeom prst="rect"/>
                         </pic:spPr>
@@ -14009,7 +14069,7 @@
       <w:r>
         <w:drawing>
           <wp:inline xmlns:a="http://schemas.openxmlformats.org/drawingml/2006/main" xmlns:pic="http://schemas.openxmlformats.org/drawingml/2006/picture">
-            <wp:extent cx="5760720" cy="3134185"/>
+            <wp:extent cx="5760720" cy="3135191"/>
             <wp:docPr id="40" name="Picture 40"/>
             <wp:cNvGraphicFramePr>
               <a:graphicFrameLocks noChangeAspect="1"/>
@@ -14030,7 +14090,7 @@
                   <pic:spPr>
                     <a:xfrm>
                       <a:off x="0" y="0"/>
-                      <a:ext cx="5760720" cy="3134185"/>
+                      <a:ext cx="5760720" cy="3135191"/>
                     </a:xfrm>
                     <a:prstGeom prst="rect"/>
                   </pic:spPr>
@@ -15121,7 +15181,7 @@
           <w:b/>
           <w:color w:val="1B7F3B"/>
         </w:rPr>
-        <w:t>The values match exactly: z_RT_categorical 280/280 (max |diff| 2.0e‑07); floor-rule segments 280/280.</w:t>
+        <w:t>The values match exactly: z_RT_categorical 280/280 (max |diff| 2.0e‑07); floor-rule segments 280/280. Figures bar by bar – F11 vs the app's categorical Risk-Taking score: 16 bars vs 16 in the Stata figure, bin edges equal to 1.5e‑07, max bar-height difference 1.3e‑08 density units (0.000 % of the tallest bar); floor-rule segments of the .dta column vs the app ranking chart: 5 bars vs 5, max bar-height difference 0.000 percentage points. (F10 is the same histogram on the raw scale; the app charts the standardised score.)</w:t>
       </w:r>
     </w:p>
     <w:p>
@@ -15862,6 +15922,9 @@
             <w:tcW w:type="dxa" w:w="4968"/>
           </w:tcPr>
           <w:p>
+            <w:pPr>
+              <w:keepNext/>
+            </w:pPr>
             <w:r/>
             <w:r>
               <w:rPr>
@@ -15876,6 +15939,9 @@
             <w:tcW w:type="dxa" w:w="4968"/>
           </w:tcPr>
           <w:p>
+            <w:pPr>
+              <w:keepNext/>
+            </w:pPr>
             <w:r/>
             <w:r>
               <w:rPr>
@@ -15996,6 +16062,9 @@
             <w:tcW w:type="dxa" w:w="4968"/>
           </w:tcPr>
           <w:p>
+            <w:pPr>
+              <w:keepNext/>
+            </w:pPr>
             <w:r/>
             <w:r>
               <w:rPr>
@@ -16010,12 +16079,15 @@
             <w:tcW w:type="dxa" w:w="4968"/>
           </w:tcPr>
           <w:p>
+            <w:pPr>
+              <w:keepNext/>
+            </w:pPr>
             <w:r/>
             <w:r>
               <w:rPr>
                 <w:b/>
               </w:rPr>
-              <w:t>App (HEAD b250f0c, Chrome capture)</w:t>
+              <w:t>App (HEAD f8dff1e, Chrome capture)</w:t>
             </w:r>
           </w:p>
         </w:tc>
@@ -16075,7 +16147,7 @@
             <w:r>
               <w:drawing>
                 <wp:inline xmlns:a="http://schemas.openxmlformats.org/drawingml/2006/main" xmlns:pic="http://schemas.openxmlformats.org/drawingml/2006/picture">
-                  <wp:extent cx="3017520" cy="1408176"/>
+                  <wp:extent cx="3017520" cy="2201974"/>
                   <wp:docPr id="44" name="Picture 44"/>
                   <wp:cNvGraphicFramePr>
                     <a:graphicFrameLocks noChangeAspect="1"/>
@@ -16096,7 +16168,7 @@
                         <pic:spPr>
                           <a:xfrm>
                             <a:off x="0" y="0"/>
-                            <a:ext cx="3017520" cy="1408176"/>
+                            <a:ext cx="3017520" cy="2201974"/>
                           </a:xfrm>
                           <a:prstGeom prst="rect"/>
                         </pic:spPr>
@@ -17603,6 +17675,9 @@
             <w:tcW w:type="dxa" w:w="4968"/>
           </w:tcPr>
           <w:p>
+            <w:pPr>
+              <w:keepNext/>
+            </w:pPr>
             <w:r/>
             <w:r>
               <w:rPr>
@@ -17617,12 +17692,15 @@
             <w:tcW w:type="dxa" w:w="4968"/>
           </w:tcPr>
           <w:p>
+            <w:pPr>
+              <w:keepNext/>
+            </w:pPr>
             <w:r/>
             <w:r>
               <w:rPr>
                 <w:b/>
               </w:rPr>
-              <w:t>App (HEAD b250f0c, Chrome capture)</w:t>
+              <w:t>App (HEAD f8dff1e, Chrome capture)</w:t>
             </w:r>
           </w:p>
         </w:tc>
@@ -17682,7 +17760,7 @@
             <w:r>
               <w:drawing>
                 <wp:inline xmlns:a="http://schemas.openxmlformats.org/drawingml/2006/main" xmlns:pic="http://schemas.openxmlformats.org/drawingml/2006/picture">
-                  <wp:extent cx="3017520" cy="1408176"/>
+                  <wp:extent cx="3017520" cy="2201974"/>
                   <wp:docPr id="46" name="Picture 46"/>
                   <wp:cNvGraphicFramePr>
                     <a:graphicFrameLocks noChangeAspect="1"/>
@@ -17703,7 +17781,7 @@
                         <pic:spPr>
                           <a:xfrm>
                             <a:off x="0" y="0"/>
-                            <a:ext cx="3017520" cy="1408176"/>
+                            <a:ext cx="3017520" cy="2201974"/>
                           </a:xfrm>
                           <a:prstGeom prst="rect"/>
                         </pic:spPr>
@@ -17725,7 +17803,7 @@
       <w:r>
         <w:drawing>
           <wp:inline xmlns:a="http://schemas.openxmlformats.org/drawingml/2006/main" xmlns:pic="http://schemas.openxmlformats.org/drawingml/2006/picture">
-            <wp:extent cx="5760720" cy="3134185"/>
+            <wp:extent cx="5760720" cy="3135191"/>
             <wp:docPr id="47" name="Picture 47"/>
             <wp:cNvGraphicFramePr>
               <a:graphicFrameLocks noChangeAspect="1"/>
@@ -17746,7 +17824,7 @@
                   <pic:spPr>
                     <a:xfrm>
                       <a:off x="0" y="0"/>
-                      <a:ext cx="5760720" cy="3134185"/>
+                      <a:ext cx="5760720" cy="3135191"/>
                     </a:xfrm>
                     <a:prstGeom prst="rect"/>
                   </pic:spPr>
@@ -17763,7 +17841,7 @@
           <w:b/>
           <w:color w:val="1B7F3B"/>
         </w:rPr>
-        <w:t>The values match exactly: z_Flexibility_calculated_ivw, z_stdactions and z_anchored_flexibility 280/280 (max |diff| ≤ 2.2e‑07), Flexibility_combined15 280/280, choice lists 280/280.</w:t>
+        <w:t>The values match exactly: z_Flexibility_calculated_ivw, z_stdactions and z_anchored_flexibility 280/280 (max |diff| ≤ 2.2e‑07), Flexibility_combined15 280/280, choice lists 280/280. Figures bar by bar – F15: 16 bars vs 16 in the Stata figure, bin edges equal to 1.1e‑07, max bar-height difference 6.9e‑10 density units (0.000 % of the tallest bar); F16: 5 bars vs 5, max bar-height difference 0.000 percentage points. F13 and F14 have no app chart (columns verified 280/280).</w:t>
       </w:r>
     </w:p>
     <w:p>
@@ -18638,7 +18716,7 @@
             <w:r>
               <w:drawing>
                 <wp:inline xmlns:a="http://schemas.openxmlformats.org/drawingml/2006/main" xmlns:pic="http://schemas.openxmlformats.org/drawingml/2006/picture">
-                  <wp:extent cx="3017520" cy="1408176"/>
+                  <wp:extent cx="3017520" cy="2201974"/>
                   <wp:docPr id="49" name="Picture 49"/>
                   <wp:cNvGraphicFramePr>
                     <a:graphicFrameLocks noChangeAspect="1"/>
@@ -18659,7 +18737,7 @@
                         <pic:spPr>
                           <a:xfrm>
                             <a:off x="0" y="0"/>
-                            <a:ext cx="3017520" cy="1408176"/>
+                            <a:ext cx="3017520" cy="2201974"/>
                           </a:xfrm>
                           <a:prstGeom prst="rect"/>
                         </pic:spPr>
@@ -18680,7 +18758,7 @@
             <w:r>
               <w:drawing>
                 <wp:inline xmlns:a="http://schemas.openxmlformats.org/drawingml/2006/main" xmlns:pic="http://schemas.openxmlformats.org/drawingml/2006/picture">
-                  <wp:extent cx="3017520" cy="1641716"/>
+                  <wp:extent cx="3017520" cy="1642243"/>
                   <wp:docPr id="50" name="Picture 50"/>
                   <wp:cNvGraphicFramePr>
                     <a:graphicFrameLocks noChangeAspect="1"/>
@@ -18701,7 +18779,7 @@
                         <pic:spPr>
                           <a:xfrm>
                             <a:off x="0" y="0"/>
-                            <a:ext cx="3017520" cy="1641716"/>
+                            <a:ext cx="3017520" cy="1642243"/>
                           </a:xfrm>
                           <a:prstGeom prst="rect"/>
                         </pic:spPr>
@@ -18789,7 +18867,7 @@
               <w:rPr>
                 <w:sz w:val="18"/>
               </w:rPr>
-              <w:t>98.9%  ({'multiple': 215, 'unique_with_ties': 62, 'unique': 3})</w:t>
+              <w:t>98.9%  ({'multiple': 215, 'unique': 3, 'unique_with_ties': 62})</w:t>
             </w:r>
           </w:p>
         </w:tc>
@@ -18822,7 +18900,7 @@
               <w:rPr>
                 <w:sz w:val="18"/>
               </w:rPr>
-              <w:t>footrule: 101 (36.1%), random: 93 (33.2%), copeland: 83 (29.6%), kemeny: 3 (1.1%)</w:t>
+              <w:t>copeland: 83 (29.6%), footrule: 101 (36.1%), kemeny: 3 (1.1%), random: 93 (33.2%)</w:t>
             </w:r>
           </w:p>
         </w:tc>
@@ -18888,7 +18966,7 @@
               <w:rPr>
                 <w:sz w:val="18"/>
               </w:rPr>
-              <w:t>{'option5': 104, 'length': 100, 'both': 76}</w:t>
+              <w:t>{'both': 76, 'length': 100, 'option5': 104}</w:t>
             </w:r>
           </w:p>
         </w:tc>
@@ -18984,7 +19062,7 @@
           <w:b w:val="0"/>
           <w:i w:val="0"/>
         </w:rPr>
-        <w:t>Settings: Page 1 Population = Research Specification (same 280 participants, random order), 280 agents, seed 42; Decision 4 tab: "Use Normal(anchor, σ) draw in Research Specification mode" checked, σ uniform, coefficient 1.00 (σ used: TTP 0.395446, Loyalty 0.4665145, WTP 0.4526575, RT 0.395222, Flexibility 0.4346229); intercepts 0.</w:t>
+        <w:t>Settings: Page 1 Population = Research Specification (the same 280 participants in file order), 280 agents, seed 42; Decision 4 tab: "Use Normal(anchor, σ) draw in Research Specification mode" checked, σ uniform, coefficient 1.00 (σ used: TTP 0.395446, Loyalty 0.4665145, WTP 0.4526575, RT 0.395222, Flexibility 0.4346229); intercepts 0.</w:t>
       </w:r>
     </w:p>
     <w:p>
@@ -19597,7 +19675,7 @@
             <w:r>
               <w:drawing>
                 <wp:inline xmlns:a="http://schemas.openxmlformats.org/drawingml/2006/main" xmlns:pic="http://schemas.openxmlformats.org/drawingml/2006/picture">
-                  <wp:extent cx="3017520" cy="1408176"/>
+                  <wp:extent cx="3017520" cy="2201974"/>
                   <wp:docPr id="51" name="Picture 51"/>
                   <wp:cNvGraphicFramePr>
                     <a:graphicFrameLocks noChangeAspect="1"/>
@@ -19618,7 +19696,7 @@
                         <pic:spPr>
                           <a:xfrm>
                             <a:off x="0" y="0"/>
-                            <a:ext cx="3017520" cy="1408176"/>
+                            <a:ext cx="3017520" cy="2201974"/>
                           </a:xfrm>
                           <a:prstGeom prst="rect"/>
                         </pic:spPr>
@@ -19639,7 +19717,7 @@
             <w:r>
               <w:drawing>
                 <wp:inline xmlns:a="http://schemas.openxmlformats.org/drawingml/2006/main" xmlns:pic="http://schemas.openxmlformats.org/drawingml/2006/picture">
-                  <wp:extent cx="3017520" cy="1408176"/>
+                  <wp:extent cx="3017520" cy="2201974"/>
                   <wp:docPr id="52" name="Picture 52"/>
                   <wp:cNvGraphicFramePr>
                     <a:graphicFrameLocks noChangeAspect="1"/>
@@ -19660,7 +19738,7 @@
                         <pic:spPr>
                           <a:xfrm>
                             <a:off x="0" y="0"/>
-                            <a:ext cx="3017520" cy="1408176"/>
+                            <a:ext cx="3017520" cy="2201974"/>
                           </a:xfrm>
                           <a:prstGeom prst="rect"/>
                         </pic:spPr>
@@ -19682,7 +19760,7 @@
       <w:r>
         <w:drawing>
           <wp:inline xmlns:a="http://schemas.openxmlformats.org/drawingml/2006/main" xmlns:pic="http://schemas.openxmlformats.org/drawingml/2006/picture">
-            <wp:extent cx="5760720" cy="3134185"/>
+            <wp:extent cx="5760720" cy="3135191"/>
             <wp:docPr id="53" name="Picture 53"/>
             <wp:cNvGraphicFramePr>
               <a:graphicFrameLocks noChangeAspect="1"/>
@@ -19703,7 +19781,7 @@
                   <pic:spPr>
                     <a:xfrm>
                       <a:off x="0" y="0"/>
-                      <a:ext cx="5760720" cy="3134185"/>
+                      <a:ext cx="5760720" cy="3135191"/>
                     </a:xfrm>
                     <a:prstGeom prst="rect"/>
                   </pic:spPr>
@@ -19747,7 +19825,7 @@
       <w:r>
         <w:drawing>
           <wp:inline xmlns:a="http://schemas.openxmlformats.org/drawingml/2006/main" xmlns:pic="http://schemas.openxmlformats.org/drawingml/2006/picture">
-            <wp:extent cx="5760720" cy="3134185"/>
+            <wp:extent cx="5760720" cy="3135191"/>
             <wp:docPr id="54" name="Picture 54"/>
             <wp:cNvGraphicFramePr>
               <a:graphicFrameLocks noChangeAspect="1"/>
@@ -19768,7 +19846,7 @@
                   <pic:spPr>
                     <a:xfrm>
                       <a:off x="0" y="0"/>
-                      <a:ext cx="5760720" cy="3134185"/>
+                      <a:ext cx="5760720" cy="3135191"/>
                     </a:xfrm>
                     <a:prstGeom prst="rect"/>
                   </pic:spPr>
@@ -19786,7 +19864,7 @@
       <w:r>
         <w:drawing>
           <wp:inline xmlns:a="http://schemas.openxmlformats.org/drawingml/2006/main" xmlns:pic="http://schemas.openxmlformats.org/drawingml/2006/picture">
-            <wp:extent cx="5760720" cy="3134185"/>
+            <wp:extent cx="5760720" cy="3135191"/>
             <wp:docPr id="55" name="Picture 55"/>
             <wp:cNvGraphicFramePr>
               <a:graphicFrameLocks noChangeAspect="1"/>
@@ -19807,7 +19885,7 @@
                   <pic:spPr>
                     <a:xfrm>
                       <a:off x="0" y="0"/>
-                      <a:ext cx="5760720" cy="3134185"/>
+                      <a:ext cx="5760720" cy="3135191"/>
                     </a:xfrm>
                     <a:prstGeom prst="rect"/>
                   </pic:spPr>
@@ -19824,7 +19902,7 @@
           <w:b w:val="0"/>
           <w:i w:val="0"/>
         </w:rPr>
-        <w:t>As in the Decision 1 comparison, the Copula column cannot match the Stata values: it is a synthetic population bootstrapped from the fitted copula, never the original 280 participants (here Min −0.0952 / Max 0.1101 for the TTP score vs −0.0718 / 0.1380). Research Specification and Research Baseline carry the original participants; with σ off they give the same multiset of per-agent values (Research Specification permutes the order).</w:t>
+        <w:t>As in the Decision 1 comparison, the Copula column cannot match the Stata values: it is a synthetic population drawn from the fitted copula, never the original 280 participants (here Min −0.0952 / Max 0.1130 for the TTP score vs −0.0718 / 0.1380). Research Specification and Research Baseline carry the original participants in the same file order; with σ off (or σ coefficient 0) Research Specification reproduces Research Baseline agent for agent (verified on every rtd_* column and list).</w:t>
       </w:r>
     </w:p>
     <w:p>
@@ -19841,7 +19919,2135 @@
         <w:pStyle w:val="Heading1"/>
       </w:pPr>
       <w:r>
-        <w:t>Appendix A: Per-participant verification against the .dta (controller script, seam path)</w:t>
+        <w:t>Appendix A: Bar-by-bar check of every figure pair</w:t>
+      </w:r>
+    </w:p>
+    <w:p>
+      <w:r>
+        <w:rPr>
+          <w:b w:val="0"/>
+          <w:i w:val="0"/>
+        </w:rPr>
+        <w:t>For each Stata figure the document's bin count was established from the figure itself (bar heights measured in the image and matched against np.histogram of the .dta column at 14…18 bins: all eleven continuous histograms match 16 bins with a maximum relative bar error ≤ 0.5 % – F14 2.1 % because of its very small bars – while 17 bins give 19–40 %; the five discrete figures match the value counts). The app chart's bars were then read from the running app's Plotly figure objects (bin edges, densities / percentages) and compared with the same np.histogram / value counts. "Max bar difference" is the largest absolute difference in bar height over all bars; for histograms it is also given relative to the tallest bar.</w:t>
+      </w:r>
+    </w:p>
+    <w:tbl>
+      <w:tblPr>
+        <w:tblStyle w:val="TableGrid"/>
+        <w:tblW w:type="auto" w:w="0"/>
+        <w:tblLook w:firstColumn="1" w:firstRow="1" w:lastColumn="0" w:lastRow="0" w:noHBand="0" w:noVBand="1" w:val="04A0"/>
+      </w:tblPr>
+      <w:tblGrid>
+        <w:gridCol w:w="1419"/>
+        <w:gridCol w:w="1419"/>
+        <w:gridCol w:w="1419"/>
+        <w:gridCol w:w="1419"/>
+        <w:gridCol w:w="1419"/>
+        <w:gridCol w:w="1419"/>
+        <w:gridCol w:w="1419"/>
+      </w:tblGrid>
+      <w:tr>
+        <w:trPr>
+          <w:cantSplit/>
+        </w:trPr>
+        <w:tc>
+          <w:tcPr>
+            <w:tcW w:type="dxa" w:w="1419"/>
+          </w:tcPr>
+          <w:p>
+            <w:pPr>
+              <w:keepNext/>
+            </w:pPr>
+            <w:r/>
+            <w:r>
+              <w:rPr>
+                <w:b/>
+                <w:sz w:val="18"/>
+              </w:rPr>
+              <w:t>Stata figure</w:t>
+            </w:r>
+          </w:p>
+        </w:tc>
+        <w:tc>
+          <w:tcPr>
+            <w:tcW w:type="dxa" w:w="1419"/>
+          </w:tcPr>
+          <w:p>
+            <w:pPr>
+              <w:keepNext/>
+            </w:pPr>
+            <w:r/>
+            <w:r>
+              <w:rPr>
+                <w:b/>
+                <w:sz w:val="18"/>
+              </w:rPr>
+              <w:t>.dta column</w:t>
+            </w:r>
+          </w:p>
+        </w:tc>
+        <w:tc>
+          <w:tcPr>
+            <w:tcW w:type="dxa" w:w="1419"/>
+          </w:tcPr>
+          <w:p>
+            <w:pPr>
+              <w:keepNext/>
+            </w:pPr>
+            <w:r/>
+            <w:r>
+              <w:rPr>
+                <w:b/>
+                <w:sz w:val="18"/>
+              </w:rPr>
+              <w:t>App chart</w:t>
+            </w:r>
+          </w:p>
+        </w:tc>
+        <w:tc>
+          <w:tcPr>
+            <w:tcW w:type="dxa" w:w="1419"/>
+          </w:tcPr>
+          <w:p>
+            <w:pPr>
+              <w:keepNext/>
+            </w:pPr>
+            <w:r/>
+            <w:r>
+              <w:rPr>
+                <w:b/>
+                <w:sz w:val="18"/>
+              </w:rPr>
+              <w:t>Bars Stata / app</w:t>
+            </w:r>
+          </w:p>
+        </w:tc>
+        <w:tc>
+          <w:tcPr>
+            <w:tcW w:type="dxa" w:w="1419"/>
+          </w:tcPr>
+          <w:p>
+            <w:pPr>
+              <w:keepNext/>
+            </w:pPr>
+            <w:r/>
+            <w:r>
+              <w:rPr>
+                <w:b/>
+                <w:sz w:val="18"/>
+              </w:rPr>
+              <w:t>Max edge diff</w:t>
+            </w:r>
+          </w:p>
+        </w:tc>
+        <w:tc>
+          <w:tcPr>
+            <w:tcW w:type="dxa" w:w="1419"/>
+          </w:tcPr>
+          <w:p>
+            <w:pPr>
+              <w:keepNext/>
+            </w:pPr>
+            <w:r/>
+            <w:r>
+              <w:rPr>
+                <w:b/>
+                <w:sz w:val="18"/>
+              </w:rPr>
+              <w:t>Max bar difference</w:t>
+            </w:r>
+          </w:p>
+        </w:tc>
+        <w:tc>
+          <w:tcPr>
+            <w:tcW w:type="dxa" w:w="1419"/>
+          </w:tcPr>
+          <w:p>
+            <w:pPr>
+              <w:keepNext/>
+            </w:pPr>
+            <w:r/>
+            <w:r>
+              <w:rPr>
+                <w:b/>
+                <w:sz w:val="18"/>
+              </w:rPr>
+              <w:t>Same</w:t>
+            </w:r>
+          </w:p>
+        </w:tc>
+      </w:tr>
+      <w:tr>
+        <w:trPr>
+          <w:cantSplit/>
+        </w:trPr>
+        <w:tc>
+          <w:tcPr>
+            <w:tcW w:type="dxa" w:w="1419"/>
+          </w:tcPr>
+          <w:p>
+            <w:pPr>
+              <w:keepNext/>
+            </w:pPr>
+            <w:r/>
+            <w:r>
+              <w:rPr>
+                <w:sz w:val="18"/>
+              </w:rPr>
+              <w:t>F1</w:t>
+            </w:r>
+          </w:p>
+        </w:tc>
+        <w:tc>
+          <w:tcPr>
+            <w:tcW w:type="dxa" w:w="1419"/>
+          </w:tcPr>
+          <w:p>
+            <w:pPr>
+              <w:keepNext/>
+            </w:pPr>
+            <w:r/>
+            <w:r>
+              <w:rPr>
+                <w:sz w:val="18"/>
+              </w:rPr>
+              <w:t>weighted_ttp</w:t>
+            </w:r>
+          </w:p>
+        </w:tc>
+        <w:tc>
+          <w:tcPr>
+            <w:tcW w:type="dxa" w:w="1419"/>
+          </w:tcPr>
+          <w:p>
+            <w:pPr>
+              <w:keepNext/>
+            </w:pPr>
+            <w:r/>
+            <w:r>
+              <w:rPr>
+                <w:sz w:val="18"/>
+              </w:rPr>
+              <w:t>Tendency to Plan score</w:t>
+            </w:r>
+          </w:p>
+        </w:tc>
+        <w:tc>
+          <w:tcPr>
+            <w:tcW w:type="dxa" w:w="1419"/>
+          </w:tcPr>
+          <w:p>
+            <w:pPr>
+              <w:keepNext/>
+            </w:pPr>
+            <w:r/>
+            <w:r>
+              <w:rPr>
+                <w:sz w:val="18"/>
+              </w:rPr>
+              <w:t>16 / 16</w:t>
+            </w:r>
+          </w:p>
+        </w:tc>
+        <w:tc>
+          <w:tcPr>
+            <w:tcW w:type="dxa" w:w="1419"/>
+          </w:tcPr>
+          <w:p>
+            <w:pPr>
+              <w:keepNext/>
+            </w:pPr>
+            <w:r/>
+            <w:r>
+              <w:rPr>
+                <w:sz w:val="18"/>
+              </w:rPr>
+              <w:t>7.7e‑09</w:t>
+            </w:r>
+          </w:p>
+        </w:tc>
+        <w:tc>
+          <w:tcPr>
+            <w:tcW w:type="dxa" w:w="1419"/>
+          </w:tcPr>
+          <w:p>
+            <w:pPr>
+              <w:keepNext/>
+            </w:pPr>
+            <w:r/>
+            <w:r>
+              <w:rPr>
+                <w:sz w:val="18"/>
+              </w:rPr>
+              <w:t>3.6e‑08 (0.000 % of tallest bar)</w:t>
+            </w:r>
+          </w:p>
+        </w:tc>
+        <w:tc>
+          <w:tcPr>
+            <w:tcW w:type="dxa" w:w="1419"/>
+          </w:tcPr>
+          <w:p>
+            <w:pPr>
+              <w:keepNext/>
+            </w:pPr>
+            <w:r/>
+            <w:r>
+              <w:rPr>
+                <w:sz w:val="18"/>
+              </w:rPr>
+              <w:t>yes</w:t>
+            </w:r>
+          </w:p>
+        </w:tc>
+      </w:tr>
+      <w:tr>
+        <w:trPr>
+          <w:cantSplit/>
+        </w:trPr>
+        <w:tc>
+          <w:tcPr>
+            <w:tcW w:type="dxa" w:w="1419"/>
+          </w:tcPr>
+          <w:p>
+            <w:pPr>
+              <w:keepNext/>
+            </w:pPr>
+            <w:r/>
+            <w:r>
+              <w:rPr>
+                <w:sz w:val="18"/>
+              </w:rPr>
+              <w:t>F2</w:t>
+            </w:r>
+          </w:p>
+        </w:tc>
+        <w:tc>
+          <w:tcPr>
+            <w:tcW w:type="dxa" w:w="1419"/>
+          </w:tcPr>
+          <w:p>
+            <w:pPr>
+              <w:keepNext/>
+            </w:pPr>
+            <w:r/>
+            <w:r>
+              <w:rPr>
+                <w:sz w:val="18"/>
+              </w:rPr>
+              <w:t>choice_length_deterministic</w:t>
+            </w:r>
+          </w:p>
+        </w:tc>
+        <w:tc>
+          <w:tcPr>
+            <w:tcW w:type="dxa" w:w="1419"/>
+          </w:tcPr>
+          <w:p>
+            <w:pPr>
+              <w:keepNext/>
+            </w:pPr>
+            <w:r/>
+            <w:r>
+              <w:rPr>
+                <w:sz w:val="18"/>
+              </w:rPr>
+              <w:t>Number of pre-selected options</w:t>
+            </w:r>
+          </w:p>
+        </w:tc>
+        <w:tc>
+          <w:tcPr>
+            <w:tcW w:type="dxa" w:w="1419"/>
+          </w:tcPr>
+          <w:p>
+            <w:pPr>
+              <w:keepNext/>
+            </w:pPr>
+            <w:r/>
+            <w:r>
+              <w:rPr>
+                <w:sz w:val="18"/>
+              </w:rPr>
+              <w:t>6 / 6</w:t>
+            </w:r>
+          </w:p>
+        </w:tc>
+        <w:tc>
+          <w:tcPr>
+            <w:tcW w:type="dxa" w:w="1419"/>
+          </w:tcPr>
+          <w:p>
+            <w:pPr>
+              <w:keepNext/>
+            </w:pPr>
+            <w:r/>
+            <w:r>
+              <w:rPr>
+                <w:sz w:val="18"/>
+              </w:rPr>
+              <w:t>–</w:t>
+            </w:r>
+          </w:p>
+        </w:tc>
+        <w:tc>
+          <w:tcPr>
+            <w:tcW w:type="dxa" w:w="1419"/>
+          </w:tcPr>
+          <w:p>
+            <w:pPr>
+              <w:keepNext/>
+            </w:pPr>
+            <w:r/>
+            <w:r>
+              <w:rPr>
+                <w:sz w:val="18"/>
+              </w:rPr>
+              <w:t>0.000 pp</w:t>
+            </w:r>
+          </w:p>
+        </w:tc>
+        <w:tc>
+          <w:tcPr>
+            <w:tcW w:type="dxa" w:w="1419"/>
+          </w:tcPr>
+          <w:p>
+            <w:pPr>
+              <w:keepNext/>
+            </w:pPr>
+            <w:r/>
+            <w:r>
+              <w:rPr>
+                <w:sz w:val="18"/>
+              </w:rPr>
+              <w:t>yes</w:t>
+            </w:r>
+          </w:p>
+        </w:tc>
+      </w:tr>
+      <w:tr>
+        <w:trPr>
+          <w:cantSplit/>
+        </w:trPr>
+        <w:tc>
+          <w:tcPr>
+            <w:tcW w:type="dxa" w:w="1419"/>
+          </w:tcPr>
+          <w:p>
+            <w:pPr>
+              <w:keepNext/>
+            </w:pPr>
+            <w:r/>
+            <w:r>
+              <w:rPr>
+                <w:sz w:val="18"/>
+              </w:rPr>
+              <w:t>F3</w:t>
+            </w:r>
+          </w:p>
+        </w:tc>
+        <w:tc>
+          <w:tcPr>
+            <w:tcW w:type="dxa" w:w="1419"/>
+          </w:tcPr>
+          <w:p>
+            <w:pPr>
+              <w:keepNext/>
+            </w:pPr>
+            <w:r/>
+            <w:r>
+              <w:rPr>
+                <w:sz w:val="18"/>
+              </w:rPr>
+              <w:t>weighted_loyalty</w:t>
+            </w:r>
+          </w:p>
+        </w:tc>
+        <w:tc>
+          <w:tcPr>
+            <w:tcW w:type="dxa" w:w="1419"/>
+          </w:tcPr>
+          <w:p>
+            <w:pPr>
+              <w:keepNext/>
+            </w:pPr>
+            <w:r/>
+            <w:r>
+              <w:rPr>
+                <w:sz w:val="18"/>
+              </w:rPr>
+              <w:t>Loyalty score</w:t>
+            </w:r>
+          </w:p>
+        </w:tc>
+        <w:tc>
+          <w:tcPr>
+            <w:tcW w:type="dxa" w:w="1419"/>
+          </w:tcPr>
+          <w:p>
+            <w:pPr>
+              <w:keepNext/>
+            </w:pPr>
+            <w:r/>
+            <w:r>
+              <w:rPr>
+                <w:sz w:val="18"/>
+              </w:rPr>
+              <w:t>16 / 16</w:t>
+            </w:r>
+          </w:p>
+        </w:tc>
+        <w:tc>
+          <w:tcPr>
+            <w:tcW w:type="dxa" w:w="1419"/>
+          </w:tcPr>
+          <w:p>
+            <w:pPr>
+              <w:keepNext/>
+            </w:pPr>
+            <w:r/>
+            <w:r>
+              <w:rPr>
+                <w:sz w:val="18"/>
+              </w:rPr>
+              <w:t>7.2e‑08</w:t>
+            </w:r>
+          </w:p>
+        </w:tc>
+        <w:tc>
+          <w:tcPr>
+            <w:tcW w:type="dxa" w:w="1419"/>
+          </w:tcPr>
+          <w:p>
+            <w:pPr>
+              <w:keepNext/>
+            </w:pPr>
+            <w:r/>
+            <w:r>
+              <w:rPr>
+                <w:sz w:val="18"/>
+              </w:rPr>
+              <w:t>2.6e‑09 (0.000 % of tallest bar)</w:t>
+            </w:r>
+          </w:p>
+        </w:tc>
+        <w:tc>
+          <w:tcPr>
+            <w:tcW w:type="dxa" w:w="1419"/>
+          </w:tcPr>
+          <w:p>
+            <w:pPr>
+              <w:keepNext/>
+            </w:pPr>
+            <w:r/>
+            <w:r>
+              <w:rPr>
+                <w:sz w:val="18"/>
+              </w:rPr>
+              <w:t>yes</w:t>
+            </w:r>
+          </w:p>
+        </w:tc>
+      </w:tr>
+      <w:tr>
+        <w:trPr>
+          <w:cantSplit/>
+        </w:trPr>
+        <w:tc>
+          <w:tcPr>
+            <w:tcW w:type="dxa" w:w="1419"/>
+          </w:tcPr>
+          <w:p>
+            <w:pPr>
+              <w:keepNext/>
+            </w:pPr>
+            <w:r/>
+            <w:r>
+              <w:rPr>
+                <w:sz w:val="18"/>
+              </w:rPr>
+              <w:t>F4</w:t>
+            </w:r>
+          </w:p>
+        </w:tc>
+        <w:tc>
+          <w:tcPr>
+            <w:tcW w:type="dxa" w:w="1419"/>
+          </w:tcPr>
+          <w:p>
+            <w:pPr>
+              <w:keepNext/>
+            </w:pPr>
+            <w:r/>
+            <w:r>
+              <w:rPr>
+                <w:sz w:val="18"/>
+              </w:rPr>
+              <w:t>weighted_loyalty15</w:t>
+            </w:r>
+          </w:p>
+        </w:tc>
+        <w:tc>
+          <w:tcPr>
+            <w:tcW w:type="dxa" w:w="1419"/>
+          </w:tcPr>
+          <w:p>
+            <w:pPr>
+              <w:keepNext/>
+            </w:pPr>
+            <w:r/>
+            <w:r>
+              <w:rPr>
+                <w:sz w:val="18"/>
+              </w:rPr>
+              <w:t>% of loyalty-based options ranking</w:t>
+            </w:r>
+          </w:p>
+        </w:tc>
+        <w:tc>
+          <w:tcPr>
+            <w:tcW w:type="dxa" w:w="1419"/>
+          </w:tcPr>
+          <w:p>
+            <w:pPr>
+              <w:keepNext/>
+            </w:pPr>
+            <w:r/>
+            <w:r>
+              <w:rPr>
+                <w:sz w:val="18"/>
+              </w:rPr>
+              <w:t>5 / 5</w:t>
+            </w:r>
+          </w:p>
+        </w:tc>
+        <w:tc>
+          <w:tcPr>
+            <w:tcW w:type="dxa" w:w="1419"/>
+          </w:tcPr>
+          <w:p>
+            <w:pPr>
+              <w:keepNext/>
+            </w:pPr>
+            <w:r/>
+            <w:r>
+              <w:rPr>
+                <w:sz w:val="18"/>
+              </w:rPr>
+              <w:t>–</w:t>
+            </w:r>
+          </w:p>
+        </w:tc>
+        <w:tc>
+          <w:tcPr>
+            <w:tcW w:type="dxa" w:w="1419"/>
+          </w:tcPr>
+          <w:p>
+            <w:pPr>
+              <w:keepNext/>
+            </w:pPr>
+            <w:r/>
+            <w:r>
+              <w:rPr>
+                <w:sz w:val="18"/>
+              </w:rPr>
+              <w:t>0.000 pp</w:t>
+            </w:r>
+          </w:p>
+        </w:tc>
+        <w:tc>
+          <w:tcPr>
+            <w:tcW w:type="dxa" w:w="1419"/>
+          </w:tcPr>
+          <w:p>
+            <w:pPr>
+              <w:keepNext/>
+            </w:pPr>
+            <w:r/>
+            <w:r>
+              <w:rPr>
+                <w:sz w:val="18"/>
+              </w:rPr>
+              <w:t>yes</w:t>
+            </w:r>
+          </w:p>
+        </w:tc>
+      </w:tr>
+      <w:tr>
+        <w:trPr>
+          <w:cantSplit/>
+        </w:trPr>
+        <w:tc>
+          <w:tcPr>
+            <w:tcW w:type="dxa" w:w="1419"/>
+          </w:tcPr>
+          <w:p>
+            <w:pPr>
+              <w:keepNext/>
+            </w:pPr>
+            <w:r/>
+            <w:r>
+              <w:rPr>
+                <w:sz w:val="18"/>
+              </w:rPr>
+              <w:t>F6</w:t>
+            </w:r>
+          </w:p>
+        </w:tc>
+        <w:tc>
+          <w:tcPr>
+            <w:tcW w:type="dxa" w:w="1419"/>
+          </w:tcPr>
+          <w:p>
+            <w:pPr>
+              <w:keepNext/>
+            </w:pPr>
+            <w:r/>
+            <w:r>
+              <w:rPr>
+                <w:sz w:val="18"/>
+              </w:rPr>
+              <w:t>z_WTP_calculated</w:t>
+            </w:r>
+          </w:p>
+        </w:tc>
+        <w:tc>
+          <w:tcPr>
+            <w:tcW w:type="dxa" w:w="1419"/>
+          </w:tcPr>
+          <w:p>
+            <w:pPr>
+              <w:keepNext/>
+            </w:pPr>
+            <w:r/>
+            <w:r>
+              <w:rPr>
+                <w:sz w:val="18"/>
+              </w:rPr>
+              <w:t>Willingness-to-Pay score (Continuous only)</w:t>
+            </w:r>
+          </w:p>
+        </w:tc>
+        <w:tc>
+          <w:tcPr>
+            <w:tcW w:type="dxa" w:w="1419"/>
+          </w:tcPr>
+          <w:p>
+            <w:pPr>
+              <w:keepNext/>
+            </w:pPr>
+            <w:r/>
+            <w:r>
+              <w:rPr>
+                <w:sz w:val="18"/>
+              </w:rPr>
+              <w:t>16 / 16</w:t>
+            </w:r>
+          </w:p>
+        </w:tc>
+        <w:tc>
+          <w:tcPr>
+            <w:tcW w:type="dxa" w:w="1419"/>
+          </w:tcPr>
+          <w:p>
+            <w:pPr>
+              <w:keepNext/>
+            </w:pPr>
+            <w:r/>
+            <w:r>
+              <w:rPr>
+                <w:sz w:val="18"/>
+              </w:rPr>
+              <w:t>3.9e‑06</w:t>
+            </w:r>
+          </w:p>
+        </w:tc>
+        <w:tc>
+          <w:tcPr>
+            <w:tcW w:type="dxa" w:w="1419"/>
+          </w:tcPr>
+          <w:p>
+            <w:pPr>
+              <w:keepNext/>
+            </w:pPr>
+            <w:r/>
+            <w:r>
+              <w:rPr>
+                <w:sz w:val="18"/>
+              </w:rPr>
+              <w:t>5.8e‑07 (0.000 % of tallest bar)</w:t>
+            </w:r>
+          </w:p>
+        </w:tc>
+        <w:tc>
+          <w:tcPr>
+            <w:tcW w:type="dxa" w:w="1419"/>
+          </w:tcPr>
+          <w:p>
+            <w:pPr>
+              <w:keepNext/>
+            </w:pPr>
+            <w:r/>
+            <w:r>
+              <w:rPr>
+                <w:sz w:val="18"/>
+              </w:rPr>
+              <w:t>yes</w:t>
+            </w:r>
+          </w:p>
+        </w:tc>
+      </w:tr>
+      <w:tr>
+        <w:trPr>
+          <w:cantSplit/>
+        </w:trPr>
+        <w:tc>
+          <w:tcPr>
+            <w:tcW w:type="dxa" w:w="1419"/>
+          </w:tcPr>
+          <w:p>
+            <w:pPr>
+              <w:keepNext/>
+            </w:pPr>
+            <w:r/>
+            <w:r>
+              <w:rPr>
+                <w:sz w:val="18"/>
+              </w:rPr>
+              <w:t>F8</w:t>
+            </w:r>
+          </w:p>
+        </w:tc>
+        <w:tc>
+          <w:tcPr>
+            <w:tcW w:type="dxa" w:w="1419"/>
+          </w:tcPr>
+          <w:p>
+            <w:pPr>
+              <w:keepNext/>
+            </w:pPr>
+            <w:r/>
+            <w:r>
+              <w:rPr>
+                <w:sz w:val="18"/>
+              </w:rPr>
+              <w:t>WTP_calculated15</w:t>
+            </w:r>
+          </w:p>
+        </w:tc>
+        <w:tc>
+          <w:tcPr>
+            <w:tcW w:type="dxa" w:w="1419"/>
+          </w:tcPr>
+          <w:p>
+            <w:pPr>
+              <w:keepNext/>
+            </w:pPr>
+            <w:r/>
+            <w:r>
+              <w:rPr>
+                <w:sz w:val="18"/>
+              </w:rPr>
+              <w:t>% of willingness-to-pay-based options ranking (Continuous only)</w:t>
+            </w:r>
+          </w:p>
+        </w:tc>
+        <w:tc>
+          <w:tcPr>
+            <w:tcW w:type="dxa" w:w="1419"/>
+          </w:tcPr>
+          <w:p>
+            <w:pPr>
+              <w:keepNext/>
+            </w:pPr>
+            <w:r/>
+            <w:r>
+              <w:rPr>
+                <w:sz w:val="18"/>
+              </w:rPr>
+              <w:t>5 / 5</w:t>
+            </w:r>
+          </w:p>
+        </w:tc>
+        <w:tc>
+          <w:tcPr>
+            <w:tcW w:type="dxa" w:w="1419"/>
+          </w:tcPr>
+          <w:p>
+            <w:pPr>
+              <w:keepNext/>
+            </w:pPr>
+            <w:r/>
+            <w:r>
+              <w:rPr>
+                <w:sz w:val="18"/>
+              </w:rPr>
+              <w:t>–</w:t>
+            </w:r>
+          </w:p>
+        </w:tc>
+        <w:tc>
+          <w:tcPr>
+            <w:tcW w:type="dxa" w:w="1419"/>
+          </w:tcPr>
+          <w:p>
+            <w:pPr>
+              <w:keepNext/>
+            </w:pPr>
+            <w:r/>
+            <w:r>
+              <w:rPr>
+                <w:sz w:val="18"/>
+              </w:rPr>
+              <w:t>0.000 pp</w:t>
+            </w:r>
+          </w:p>
+        </w:tc>
+        <w:tc>
+          <w:tcPr>
+            <w:tcW w:type="dxa" w:w="1419"/>
+          </w:tcPr>
+          <w:p>
+            <w:pPr>
+              <w:keepNext/>
+            </w:pPr>
+            <w:r/>
+            <w:r>
+              <w:rPr>
+                <w:sz w:val="18"/>
+              </w:rPr>
+              <w:t>yes</w:t>
+            </w:r>
+          </w:p>
+        </w:tc>
+      </w:tr>
+      <w:tr>
+        <w:trPr>
+          <w:cantSplit/>
+        </w:trPr>
+        <w:tc>
+          <w:tcPr>
+            <w:tcW w:type="dxa" w:w="1419"/>
+          </w:tcPr>
+          <w:p>
+            <w:pPr>
+              <w:keepNext/>
+            </w:pPr>
+            <w:r/>
+            <w:r>
+              <w:rPr>
+                <w:sz w:val="18"/>
+              </w:rPr>
+              <w:t>F7</w:t>
+            </w:r>
+          </w:p>
+        </w:tc>
+        <w:tc>
+          <w:tcPr>
+            <w:tcW w:type="dxa" w:w="1419"/>
+          </w:tcPr>
+          <w:p>
+            <w:pPr>
+              <w:keepNext/>
+            </w:pPr>
+            <w:r/>
+            <w:r>
+              <w:rPr>
+                <w:sz w:val="18"/>
+              </w:rPr>
+              <w:t>z_WTP_categorical (stored .dta column, superseded formula)</w:t>
+            </w:r>
+          </w:p>
+        </w:tc>
+        <w:tc>
+          <w:tcPr>
+            <w:tcW w:type="dxa" w:w="1419"/>
+          </w:tcPr>
+          <w:p>
+            <w:pPr>
+              <w:keepNext/>
+            </w:pPr>
+            <w:r/>
+            <w:r>
+              <w:rPr>
+                <w:sz w:val="18"/>
+              </w:rPr>
+              <w:t>Willingness-to-Pay score (Categorical only)</w:t>
+            </w:r>
+          </w:p>
+        </w:tc>
+        <w:tc>
+          <w:tcPr>
+            <w:tcW w:type="dxa" w:w="1419"/>
+          </w:tcPr>
+          <w:p>
+            <w:pPr>
+              <w:keepNext/>
+            </w:pPr>
+            <w:r/>
+            <w:r>
+              <w:rPr>
+                <w:sz w:val="18"/>
+              </w:rPr>
+              <w:t>16 / 16</w:t>
+            </w:r>
+          </w:p>
+        </w:tc>
+        <w:tc>
+          <w:tcPr>
+            <w:tcW w:type="dxa" w:w="1419"/>
+          </w:tcPr>
+          <w:p>
+            <w:pPr>
+              <w:keepNext/>
+            </w:pPr>
+            <w:r/>
+            <w:r>
+              <w:rPr>
+                <w:sz w:val="18"/>
+              </w:rPr>
+              <w:t>1.7e‑02</w:t>
+            </w:r>
+          </w:p>
+        </w:tc>
+        <w:tc>
+          <w:tcPr>
+            <w:tcW w:type="dxa" w:w="1419"/>
+          </w:tcPr>
+          <w:p>
+            <w:pPr>
+              <w:keepNext/>
+            </w:pPr>
+            <w:r/>
+            <w:r>
+              <w:rPr>
+                <w:sz w:val="18"/>
+              </w:rPr>
+              <w:t>1.6e‑01 (24.686 % of tallest bar)</w:t>
+            </w:r>
+          </w:p>
+        </w:tc>
+        <w:tc>
+          <w:tcPr>
+            <w:tcW w:type="dxa" w:w="1419"/>
+          </w:tcPr>
+          <w:p>
+            <w:pPr>
+              <w:keepNext/>
+            </w:pPr>
+            <w:r/>
+            <w:r>
+              <w:rPr>
+                <w:sz w:val="18"/>
+              </w:rPr>
+              <w:t>NO</w:t>
+            </w:r>
+          </w:p>
+        </w:tc>
+      </w:tr>
+      <w:tr>
+        <w:trPr>
+          <w:cantSplit/>
+        </w:trPr>
+        <w:tc>
+          <w:tcPr>
+            <w:tcW w:type="dxa" w:w="1419"/>
+          </w:tcPr>
+          <w:p>
+            <w:pPr>
+              <w:keepNext/>
+            </w:pPr>
+            <w:r/>
+            <w:r>
+              <w:rPr>
+                <w:sz w:val="18"/>
+              </w:rPr>
+              <w:t>F7 → floor rule</w:t>
+            </w:r>
+          </w:p>
+        </w:tc>
+        <w:tc>
+          <w:tcPr>
+            <w:tcW w:type="dxa" w:w="1419"/>
+          </w:tcPr>
+          <w:p>
+            <w:pPr>
+              <w:keepNext/>
+            </w:pPr>
+            <w:r/>
+            <w:r>
+              <w:rPr>
+                <w:sz w:val="18"/>
+              </w:rPr>
+              <w:t>segments of the stored z_WTP_categorical</w:t>
+            </w:r>
+          </w:p>
+        </w:tc>
+        <w:tc>
+          <w:tcPr>
+            <w:tcW w:type="dxa" w:w="1419"/>
+          </w:tcPr>
+          <w:p>
+            <w:pPr>
+              <w:keepNext/>
+            </w:pPr>
+            <w:r/>
+            <w:r>
+              <w:rPr>
+                <w:sz w:val="18"/>
+              </w:rPr>
+              <w:t>% of willingness-to-pay-based options ranking (Categorical only)</w:t>
+            </w:r>
+          </w:p>
+        </w:tc>
+        <w:tc>
+          <w:tcPr>
+            <w:tcW w:type="dxa" w:w="1419"/>
+          </w:tcPr>
+          <w:p>
+            <w:pPr>
+              <w:keepNext/>
+            </w:pPr>
+            <w:r/>
+            <w:r>
+              <w:rPr>
+                <w:sz w:val="18"/>
+              </w:rPr>
+              <w:t>5 / 5</w:t>
+            </w:r>
+          </w:p>
+        </w:tc>
+        <w:tc>
+          <w:tcPr>
+            <w:tcW w:type="dxa" w:w="1419"/>
+          </w:tcPr>
+          <w:p>
+            <w:pPr>
+              <w:keepNext/>
+            </w:pPr>
+            <w:r/>
+            <w:r>
+              <w:rPr>
+                <w:sz w:val="18"/>
+              </w:rPr>
+              <w:t>–</w:t>
+            </w:r>
+          </w:p>
+        </w:tc>
+        <w:tc>
+          <w:tcPr>
+            <w:tcW w:type="dxa" w:w="1419"/>
+          </w:tcPr>
+          <w:p>
+            <w:pPr>
+              <w:keepNext/>
+            </w:pPr>
+            <w:r/>
+            <w:r>
+              <w:rPr>
+                <w:sz w:val="18"/>
+              </w:rPr>
+              <w:t>0.357 pp</w:t>
+            </w:r>
+          </w:p>
+        </w:tc>
+        <w:tc>
+          <w:tcPr>
+            <w:tcW w:type="dxa" w:w="1419"/>
+          </w:tcPr>
+          <w:p>
+            <w:pPr>
+              <w:keepNext/>
+            </w:pPr>
+            <w:r/>
+            <w:r>
+              <w:rPr>
+                <w:sz w:val="18"/>
+              </w:rPr>
+              <w:t>NO</w:t>
+            </w:r>
+          </w:p>
+        </w:tc>
+      </w:tr>
+      <w:tr>
+        <w:trPr>
+          <w:cantSplit/>
+        </w:trPr>
+        <w:tc>
+          <w:tcPr>
+            <w:tcW w:type="dxa" w:w="1419"/>
+          </w:tcPr>
+          <w:p>
+            <w:pPr>
+              <w:keepNext/>
+            </w:pPr>
+            <w:r/>
+            <w:r>
+              <w:rPr>
+                <w:sz w:val="18"/>
+              </w:rPr>
+              <w:t>F9</w:t>
+            </w:r>
+          </w:p>
+        </w:tc>
+        <w:tc>
+          <w:tcPr>
+            <w:tcW w:type="dxa" w:w="1419"/>
+          </w:tcPr>
+          <w:p>
+            <w:pPr>
+              <w:keepNext/>
+            </w:pPr>
+            <w:r/>
+            <w:r>
+              <w:rPr>
+                <w:sz w:val="18"/>
+              </w:rPr>
+              <w:t>z_RT_calculated_hs</w:t>
+            </w:r>
+          </w:p>
+        </w:tc>
+        <w:tc>
+          <w:tcPr>
+            <w:tcW w:type="dxa" w:w="1419"/>
+          </w:tcPr>
+          <w:p>
+            <w:pPr>
+              <w:keepNext/>
+            </w:pPr>
+            <w:r/>
+            <w:r>
+              <w:rPr>
+                <w:sz w:val="18"/>
+              </w:rPr>
+              <w:t>Risk-Taking score (Continuous only)</w:t>
+            </w:r>
+          </w:p>
+        </w:tc>
+        <w:tc>
+          <w:tcPr>
+            <w:tcW w:type="dxa" w:w="1419"/>
+          </w:tcPr>
+          <w:p>
+            <w:pPr>
+              <w:keepNext/>
+            </w:pPr>
+            <w:r/>
+            <w:r>
+              <w:rPr>
+                <w:sz w:val="18"/>
+              </w:rPr>
+              <w:t>16 / 16</w:t>
+            </w:r>
+          </w:p>
+        </w:tc>
+        <w:tc>
+          <w:tcPr>
+            <w:tcW w:type="dxa" w:w="1419"/>
+          </w:tcPr>
+          <w:p>
+            <w:pPr>
+              <w:keepNext/>
+            </w:pPr>
+            <w:r/>
+            <w:r>
+              <w:rPr>
+                <w:sz w:val="18"/>
+              </w:rPr>
+              <w:t>7.4e‑08</w:t>
+            </w:r>
+          </w:p>
+        </w:tc>
+        <w:tc>
+          <w:tcPr>
+            <w:tcW w:type="dxa" w:w="1419"/>
+          </w:tcPr>
+          <w:p>
+            <w:pPr>
+              <w:keepNext/>
+            </w:pPr>
+            <w:r/>
+            <w:r>
+              <w:rPr>
+                <w:sz w:val="18"/>
+              </w:rPr>
+              <w:t>1.3e‑09 (0.000 % of tallest bar)</w:t>
+            </w:r>
+          </w:p>
+        </w:tc>
+        <w:tc>
+          <w:tcPr>
+            <w:tcW w:type="dxa" w:w="1419"/>
+          </w:tcPr>
+          <w:p>
+            <w:pPr>
+              <w:keepNext/>
+            </w:pPr>
+            <w:r/>
+            <w:r>
+              <w:rPr>
+                <w:sz w:val="18"/>
+              </w:rPr>
+              <w:t>yes</w:t>
+            </w:r>
+          </w:p>
+        </w:tc>
+      </w:tr>
+      <w:tr>
+        <w:trPr>
+          <w:cantSplit/>
+        </w:trPr>
+        <w:tc>
+          <w:tcPr>
+            <w:tcW w:type="dxa" w:w="1419"/>
+          </w:tcPr>
+          <w:p>
+            <w:pPr>
+              <w:keepNext/>
+            </w:pPr>
+            <w:r/>
+            <w:r>
+              <w:rPr>
+                <w:sz w:val="18"/>
+              </w:rPr>
+              <w:t>F12</w:t>
+            </w:r>
+          </w:p>
+        </w:tc>
+        <w:tc>
+          <w:tcPr>
+            <w:tcW w:type="dxa" w:w="1419"/>
+          </w:tcPr>
+          <w:p>
+            <w:pPr>
+              <w:keepNext/>
+            </w:pPr>
+            <w:r/>
+            <w:r>
+              <w:rPr>
+                <w:sz w:val="18"/>
+              </w:rPr>
+              <w:t>RT_calculated15</w:t>
+            </w:r>
+          </w:p>
+        </w:tc>
+        <w:tc>
+          <w:tcPr>
+            <w:tcW w:type="dxa" w:w="1419"/>
+          </w:tcPr>
+          <w:p>
+            <w:pPr>
+              <w:keepNext/>
+            </w:pPr>
+            <w:r/>
+            <w:r>
+              <w:rPr>
+                <w:sz w:val="18"/>
+              </w:rPr>
+              <w:t>% of risk-taking-based options ranking (Continuous only)</w:t>
+            </w:r>
+          </w:p>
+        </w:tc>
+        <w:tc>
+          <w:tcPr>
+            <w:tcW w:type="dxa" w:w="1419"/>
+          </w:tcPr>
+          <w:p>
+            <w:pPr>
+              <w:keepNext/>
+            </w:pPr>
+            <w:r/>
+            <w:r>
+              <w:rPr>
+                <w:sz w:val="18"/>
+              </w:rPr>
+              <w:t>5 / 5</w:t>
+            </w:r>
+          </w:p>
+        </w:tc>
+        <w:tc>
+          <w:tcPr>
+            <w:tcW w:type="dxa" w:w="1419"/>
+          </w:tcPr>
+          <w:p>
+            <w:pPr>
+              <w:keepNext/>
+            </w:pPr>
+            <w:r/>
+            <w:r>
+              <w:rPr>
+                <w:sz w:val="18"/>
+              </w:rPr>
+              <w:t>–</w:t>
+            </w:r>
+          </w:p>
+        </w:tc>
+        <w:tc>
+          <w:tcPr>
+            <w:tcW w:type="dxa" w:w="1419"/>
+          </w:tcPr>
+          <w:p>
+            <w:pPr>
+              <w:keepNext/>
+            </w:pPr>
+            <w:r/>
+            <w:r>
+              <w:rPr>
+                <w:sz w:val="18"/>
+              </w:rPr>
+              <w:t>0.000 pp</w:t>
+            </w:r>
+          </w:p>
+        </w:tc>
+        <w:tc>
+          <w:tcPr>
+            <w:tcW w:type="dxa" w:w="1419"/>
+          </w:tcPr>
+          <w:p>
+            <w:pPr>
+              <w:keepNext/>
+            </w:pPr>
+            <w:r/>
+            <w:r>
+              <w:rPr>
+                <w:sz w:val="18"/>
+              </w:rPr>
+              <w:t>yes</w:t>
+            </w:r>
+          </w:p>
+        </w:tc>
+      </w:tr>
+      <w:tr>
+        <w:trPr>
+          <w:cantSplit/>
+        </w:trPr>
+        <w:tc>
+          <w:tcPr>
+            <w:tcW w:type="dxa" w:w="1419"/>
+          </w:tcPr>
+          <w:p>
+            <w:pPr>
+              <w:keepNext/>
+            </w:pPr>
+            <w:r/>
+            <w:r>
+              <w:rPr>
+                <w:sz w:val="18"/>
+              </w:rPr>
+              <w:t>F11</w:t>
+            </w:r>
+          </w:p>
+        </w:tc>
+        <w:tc>
+          <w:tcPr>
+            <w:tcW w:type="dxa" w:w="1419"/>
+          </w:tcPr>
+          <w:p>
+            <w:pPr>
+              <w:keepNext/>
+            </w:pPr>
+            <w:r/>
+            <w:r>
+              <w:rPr>
+                <w:sz w:val="18"/>
+              </w:rPr>
+              <w:t>z_RT_categorical</w:t>
+            </w:r>
+          </w:p>
+        </w:tc>
+        <w:tc>
+          <w:tcPr>
+            <w:tcW w:type="dxa" w:w="1419"/>
+          </w:tcPr>
+          <w:p>
+            <w:pPr>
+              <w:keepNext/>
+            </w:pPr>
+            <w:r/>
+            <w:r>
+              <w:rPr>
+                <w:sz w:val="18"/>
+              </w:rPr>
+              <w:t>Risk-Taking score (Categorical only)</w:t>
+            </w:r>
+          </w:p>
+        </w:tc>
+        <w:tc>
+          <w:tcPr>
+            <w:tcW w:type="dxa" w:w="1419"/>
+          </w:tcPr>
+          <w:p>
+            <w:pPr>
+              <w:keepNext/>
+            </w:pPr>
+            <w:r/>
+            <w:r>
+              <w:rPr>
+                <w:sz w:val="18"/>
+              </w:rPr>
+              <w:t>16 / 16</w:t>
+            </w:r>
+          </w:p>
+        </w:tc>
+        <w:tc>
+          <w:tcPr>
+            <w:tcW w:type="dxa" w:w="1419"/>
+          </w:tcPr>
+          <w:p>
+            <w:pPr>
+              <w:keepNext/>
+            </w:pPr>
+            <w:r/>
+            <w:r>
+              <w:rPr>
+                <w:sz w:val="18"/>
+              </w:rPr>
+              <w:t>1.5e‑07</w:t>
+            </w:r>
+          </w:p>
+        </w:tc>
+        <w:tc>
+          <w:tcPr>
+            <w:tcW w:type="dxa" w:w="1419"/>
+          </w:tcPr>
+          <w:p>
+            <w:pPr>
+              <w:keepNext/>
+            </w:pPr>
+            <w:r/>
+            <w:r>
+              <w:rPr>
+                <w:sz w:val="18"/>
+              </w:rPr>
+              <w:t>1.3e‑08 (0.000 % of tallest bar)</w:t>
+            </w:r>
+          </w:p>
+        </w:tc>
+        <w:tc>
+          <w:tcPr>
+            <w:tcW w:type="dxa" w:w="1419"/>
+          </w:tcPr>
+          <w:p>
+            <w:pPr>
+              <w:keepNext/>
+            </w:pPr>
+            <w:r/>
+            <w:r>
+              <w:rPr>
+                <w:sz w:val="18"/>
+              </w:rPr>
+              <w:t>yes</w:t>
+            </w:r>
+          </w:p>
+        </w:tc>
+      </w:tr>
+      <w:tr>
+        <w:trPr>
+          <w:cantSplit/>
+        </w:trPr>
+        <w:tc>
+          <w:tcPr>
+            <w:tcW w:type="dxa" w:w="1419"/>
+          </w:tcPr>
+          <w:p>
+            <w:pPr>
+              <w:keepNext/>
+            </w:pPr>
+            <w:r/>
+            <w:r>
+              <w:rPr>
+                <w:sz w:val="18"/>
+              </w:rPr>
+              <w:t>F11 → floor rule</w:t>
+            </w:r>
+          </w:p>
+        </w:tc>
+        <w:tc>
+          <w:tcPr>
+            <w:tcW w:type="dxa" w:w="1419"/>
+          </w:tcPr>
+          <w:p>
+            <w:pPr>
+              <w:keepNext/>
+            </w:pPr>
+            <w:r/>
+            <w:r>
+              <w:rPr>
+                <w:sz w:val="18"/>
+              </w:rPr>
+              <w:t>segments of z_RT_categorical</w:t>
+            </w:r>
+          </w:p>
+        </w:tc>
+        <w:tc>
+          <w:tcPr>
+            <w:tcW w:type="dxa" w:w="1419"/>
+          </w:tcPr>
+          <w:p>
+            <w:pPr>
+              <w:keepNext/>
+            </w:pPr>
+            <w:r/>
+            <w:r>
+              <w:rPr>
+                <w:sz w:val="18"/>
+              </w:rPr>
+              <w:t>% of risk-taking-based options ranking (Categorical only)</w:t>
+            </w:r>
+          </w:p>
+        </w:tc>
+        <w:tc>
+          <w:tcPr>
+            <w:tcW w:type="dxa" w:w="1419"/>
+          </w:tcPr>
+          <w:p>
+            <w:pPr>
+              <w:keepNext/>
+            </w:pPr>
+            <w:r/>
+            <w:r>
+              <w:rPr>
+                <w:sz w:val="18"/>
+              </w:rPr>
+              <w:t>5 / 5</w:t>
+            </w:r>
+          </w:p>
+        </w:tc>
+        <w:tc>
+          <w:tcPr>
+            <w:tcW w:type="dxa" w:w="1419"/>
+          </w:tcPr>
+          <w:p>
+            <w:pPr>
+              <w:keepNext/>
+            </w:pPr>
+            <w:r/>
+            <w:r>
+              <w:rPr>
+                <w:sz w:val="18"/>
+              </w:rPr>
+              <w:t>–</w:t>
+            </w:r>
+          </w:p>
+        </w:tc>
+        <w:tc>
+          <w:tcPr>
+            <w:tcW w:type="dxa" w:w="1419"/>
+          </w:tcPr>
+          <w:p>
+            <w:pPr>
+              <w:keepNext/>
+            </w:pPr>
+            <w:r/>
+            <w:r>
+              <w:rPr>
+                <w:sz w:val="18"/>
+              </w:rPr>
+              <w:t>0.000 pp</w:t>
+            </w:r>
+          </w:p>
+        </w:tc>
+        <w:tc>
+          <w:tcPr>
+            <w:tcW w:type="dxa" w:w="1419"/>
+          </w:tcPr>
+          <w:p>
+            <w:pPr>
+              <w:keepNext/>
+            </w:pPr>
+            <w:r/>
+            <w:r>
+              <w:rPr>
+                <w:sz w:val="18"/>
+              </w:rPr>
+              <w:t>yes</w:t>
+            </w:r>
+          </w:p>
+        </w:tc>
+      </w:tr>
+      <w:tr>
+        <w:trPr>
+          <w:cantSplit/>
+        </w:trPr>
+        <w:tc>
+          <w:tcPr>
+            <w:tcW w:type="dxa" w:w="1419"/>
+          </w:tcPr>
+          <w:p>
+            <w:pPr>
+              <w:keepNext/>
+            </w:pPr>
+            <w:r/>
+            <w:r>
+              <w:rPr>
+                <w:sz w:val="18"/>
+              </w:rPr>
+              <w:t>F15</w:t>
+            </w:r>
+          </w:p>
+        </w:tc>
+        <w:tc>
+          <w:tcPr>
+            <w:tcW w:type="dxa" w:w="1419"/>
+          </w:tcPr>
+          <w:p>
+            <w:pPr>
+              <w:keepNext/>
+            </w:pPr>
+            <w:r/>
+            <w:r>
+              <w:rPr>
+                <w:sz w:val="18"/>
+              </w:rPr>
+              <w:t>z_anchored_flexibility</w:t>
+            </w:r>
+          </w:p>
+        </w:tc>
+        <w:tc>
+          <w:tcPr>
+            <w:tcW w:type="dxa" w:w="1419"/>
+          </w:tcPr>
+          <w:p>
+            <w:pPr>
+              <w:keepNext/>
+            </w:pPr>
+            <w:r/>
+            <w:r>
+              <w:rPr>
+                <w:sz w:val="18"/>
+              </w:rPr>
+              <w:t>Flexibility score</w:t>
+            </w:r>
+          </w:p>
+        </w:tc>
+        <w:tc>
+          <w:tcPr>
+            <w:tcW w:type="dxa" w:w="1419"/>
+          </w:tcPr>
+          <w:p>
+            <w:pPr>
+              <w:keepNext/>
+            </w:pPr>
+            <w:r/>
+            <w:r>
+              <w:rPr>
+                <w:sz w:val="18"/>
+              </w:rPr>
+              <w:t>16 / 16</w:t>
+            </w:r>
+          </w:p>
+        </w:tc>
+        <w:tc>
+          <w:tcPr>
+            <w:tcW w:type="dxa" w:w="1419"/>
+          </w:tcPr>
+          <w:p>
+            <w:pPr>
+              <w:keepNext/>
+            </w:pPr>
+            <w:r/>
+            <w:r>
+              <w:rPr>
+                <w:sz w:val="18"/>
+              </w:rPr>
+              <w:t>1.1e‑07</w:t>
+            </w:r>
+          </w:p>
+        </w:tc>
+        <w:tc>
+          <w:tcPr>
+            <w:tcW w:type="dxa" w:w="1419"/>
+          </w:tcPr>
+          <w:p>
+            <w:pPr>
+              <w:keepNext/>
+            </w:pPr>
+            <w:r/>
+            <w:r>
+              <w:rPr>
+                <w:sz w:val="18"/>
+              </w:rPr>
+              <w:t>6.9e‑10 (0.000 % of tallest bar)</w:t>
+            </w:r>
+          </w:p>
+        </w:tc>
+        <w:tc>
+          <w:tcPr>
+            <w:tcW w:type="dxa" w:w="1419"/>
+          </w:tcPr>
+          <w:p>
+            <w:pPr>
+              <w:keepNext/>
+            </w:pPr>
+            <w:r/>
+            <w:r>
+              <w:rPr>
+                <w:sz w:val="18"/>
+              </w:rPr>
+              <w:t>yes</w:t>
+            </w:r>
+          </w:p>
+        </w:tc>
+      </w:tr>
+      <w:tr>
+        <w:trPr>
+          <w:cantSplit/>
+        </w:trPr>
+        <w:tc>
+          <w:tcPr>
+            <w:tcW w:type="dxa" w:w="1419"/>
+          </w:tcPr>
+          <w:p>
+            <w:pPr>
+              <w:keepNext/>
+            </w:pPr>
+            <w:r/>
+            <w:r>
+              <w:rPr>
+                <w:sz w:val="18"/>
+              </w:rPr>
+              <w:t>F16</w:t>
+            </w:r>
+          </w:p>
+        </w:tc>
+        <w:tc>
+          <w:tcPr>
+            <w:tcW w:type="dxa" w:w="1419"/>
+          </w:tcPr>
+          <w:p>
+            <w:pPr>
+              <w:keepNext/>
+            </w:pPr>
+            <w:r/>
+            <w:r>
+              <w:rPr>
+                <w:sz w:val="18"/>
+              </w:rPr>
+              <w:t>Flexibility_combined15</w:t>
+            </w:r>
+          </w:p>
+        </w:tc>
+        <w:tc>
+          <w:tcPr>
+            <w:tcW w:type="dxa" w:w="1419"/>
+          </w:tcPr>
+          <w:p>
+            <w:pPr>
+              <w:keepNext/>
+            </w:pPr>
+            <w:r/>
+            <w:r>
+              <w:rPr>
+                <w:sz w:val="18"/>
+              </w:rPr>
+              <w:t>% of flexibility-based options ranking</w:t>
+            </w:r>
+          </w:p>
+        </w:tc>
+        <w:tc>
+          <w:tcPr>
+            <w:tcW w:type="dxa" w:w="1419"/>
+          </w:tcPr>
+          <w:p>
+            <w:pPr>
+              <w:keepNext/>
+            </w:pPr>
+            <w:r/>
+            <w:r>
+              <w:rPr>
+                <w:sz w:val="18"/>
+              </w:rPr>
+              <w:t>5 / 5</w:t>
+            </w:r>
+          </w:p>
+        </w:tc>
+        <w:tc>
+          <w:tcPr>
+            <w:tcW w:type="dxa" w:w="1419"/>
+          </w:tcPr>
+          <w:p>
+            <w:pPr>
+              <w:keepNext/>
+            </w:pPr>
+            <w:r/>
+            <w:r>
+              <w:rPr>
+                <w:sz w:val="18"/>
+              </w:rPr>
+              <w:t>–</w:t>
+            </w:r>
+          </w:p>
+        </w:tc>
+        <w:tc>
+          <w:tcPr>
+            <w:tcW w:type="dxa" w:w="1419"/>
+          </w:tcPr>
+          <w:p>
+            <w:pPr>
+              <w:keepNext/>
+            </w:pPr>
+            <w:r/>
+            <w:r>
+              <w:rPr>
+                <w:sz w:val="18"/>
+              </w:rPr>
+              <w:t>0.000 pp</w:t>
+            </w:r>
+          </w:p>
+        </w:tc>
+        <w:tc>
+          <w:tcPr>
+            <w:tcW w:type="dxa" w:w="1419"/>
+          </w:tcPr>
+          <w:p>
+            <w:pPr>
+              <w:keepNext/>
+            </w:pPr>
+            <w:r/>
+            <w:r>
+              <w:rPr>
+                <w:sz w:val="18"/>
+              </w:rPr>
+              <w:t>yes</w:t>
+            </w:r>
+          </w:p>
+        </w:tc>
+      </w:tr>
+      <w:tr>
+        <w:trPr>
+          <w:cantSplit/>
+        </w:trPr>
+        <w:tc>
+          <w:tcPr>
+            <w:tcW w:type="dxa" w:w="1419"/>
+          </w:tcPr>
+          <w:p>
+            <w:pPr>
+              <w:keepNext/>
+            </w:pPr>
+            <w:r/>
+            <w:r>
+              <w:rPr>
+                <w:sz w:val="18"/>
+              </w:rPr>
+              <w:t>F5, F10</w:t>
+            </w:r>
+          </w:p>
+        </w:tc>
+        <w:tc>
+          <w:tcPr>
+            <w:tcW w:type="dxa" w:w="1419"/>
+          </w:tcPr>
+          <w:p>
+            <w:pPr>
+              <w:keepNext/>
+            </w:pPr>
+            <w:r/>
+            <w:r>
+              <w:rPr>
+                <w:sz w:val="18"/>
+              </w:rPr>
+              <w:t>weighted_WTP_categorical, weighted_RT_categorical (raw scale)</w:t>
+            </w:r>
+          </w:p>
+        </w:tc>
+        <w:tc>
+          <w:tcPr>
+            <w:tcW w:type="dxa" w:w="1419"/>
+          </w:tcPr>
+          <w:p>
+            <w:pPr>
+              <w:keepNext/>
+            </w:pPr>
+            <w:r/>
+            <w:r>
+              <w:rPr>
+                <w:sz w:val="18"/>
+              </w:rPr>
+              <w:t>no app chart (the app charts the standardised score; same histogram up to the x-scale)</w:t>
+            </w:r>
+          </w:p>
+        </w:tc>
+        <w:tc>
+          <w:tcPr>
+            <w:tcW w:type="dxa" w:w="1419"/>
+          </w:tcPr>
+          <w:p>
+            <w:pPr>
+              <w:keepNext/>
+            </w:pPr>
+            <w:r/>
+            <w:r>
+              <w:rPr>
+                <w:sz w:val="18"/>
+              </w:rPr>
+              <w:t>–</w:t>
+            </w:r>
+          </w:p>
+        </w:tc>
+        <w:tc>
+          <w:tcPr>
+            <w:tcW w:type="dxa" w:w="1419"/>
+          </w:tcPr>
+          <w:p>
+            <w:pPr>
+              <w:keepNext/>
+            </w:pPr>
+            <w:r/>
+            <w:r>
+              <w:rPr>
+                <w:sz w:val="18"/>
+              </w:rPr>
+              <w:t>–</w:t>
+            </w:r>
+          </w:p>
+        </w:tc>
+        <w:tc>
+          <w:tcPr>
+            <w:tcW w:type="dxa" w:w="1419"/>
+          </w:tcPr>
+          <w:p>
+            <w:pPr>
+              <w:keepNext/>
+            </w:pPr>
+            <w:r/>
+            <w:r>
+              <w:rPr>
+                <w:sz w:val="18"/>
+              </w:rPr>
+              <w:t>–</w:t>
+            </w:r>
+          </w:p>
+        </w:tc>
+        <w:tc>
+          <w:tcPr>
+            <w:tcW w:type="dxa" w:w="1419"/>
+          </w:tcPr>
+          <w:p>
+            <w:pPr>
+              <w:keepNext/>
+            </w:pPr>
+            <w:r/>
+            <w:r>
+              <w:rPr>
+                <w:sz w:val="18"/>
+              </w:rPr>
+              <w:t>n/a</w:t>
+            </w:r>
+          </w:p>
+        </w:tc>
+      </w:tr>
+      <w:tr>
+        <w:trPr>
+          <w:cantSplit/>
+        </w:trPr>
+        <w:tc>
+          <w:tcPr>
+            <w:tcW w:type="dxa" w:w="1419"/>
+          </w:tcPr>
+          <w:p>
+            <w:r/>
+            <w:r>
+              <w:rPr>
+                <w:sz w:val="18"/>
+              </w:rPr>
+              <w:t>F13, F14</w:t>
+            </w:r>
+          </w:p>
+        </w:tc>
+        <w:tc>
+          <w:tcPr>
+            <w:tcW w:type="dxa" w:w="1419"/>
+          </w:tcPr>
+          <w:p>
+            <w:r/>
+            <w:r>
+              <w:rPr>
+                <w:sz w:val="18"/>
+              </w:rPr>
+              <w:t>z_Flexibility_calculated_ivw, z_stdactionsP</w:t>
+            </w:r>
+          </w:p>
+        </w:tc>
+        <w:tc>
+          <w:tcPr>
+            <w:tcW w:type="dxa" w:w="1419"/>
+          </w:tcPr>
+          <w:p>
+            <w:r/>
+            <w:r>
+              <w:rPr>
+                <w:sz w:val="18"/>
+              </w:rPr>
+              <w:t>no app chart (export columns rtd_flex_z_ivw, rtd_z_stdactions: 280/280)</w:t>
+            </w:r>
+          </w:p>
+        </w:tc>
+        <w:tc>
+          <w:tcPr>
+            <w:tcW w:type="dxa" w:w="1419"/>
+          </w:tcPr>
+          <w:p>
+            <w:r/>
+            <w:r>
+              <w:rPr>
+                <w:sz w:val="18"/>
+              </w:rPr>
+              <w:t>–</w:t>
+            </w:r>
+          </w:p>
+        </w:tc>
+        <w:tc>
+          <w:tcPr>
+            <w:tcW w:type="dxa" w:w="1419"/>
+          </w:tcPr>
+          <w:p>
+            <w:r/>
+            <w:r>
+              <w:rPr>
+                <w:sz w:val="18"/>
+              </w:rPr>
+              <w:t>–</w:t>
+            </w:r>
+          </w:p>
+        </w:tc>
+        <w:tc>
+          <w:tcPr>
+            <w:tcW w:type="dxa" w:w="1419"/>
+          </w:tcPr>
+          <w:p>
+            <w:r/>
+            <w:r>
+              <w:rPr>
+                <w:sz w:val="18"/>
+              </w:rPr>
+              <w:t>–</w:t>
+            </w:r>
+          </w:p>
+        </w:tc>
+        <w:tc>
+          <w:tcPr>
+            <w:tcW w:type="dxa" w:w="1419"/>
+          </w:tcPr>
+          <w:p>
+            <w:r/>
+            <w:r>
+              <w:rPr>
+                <w:sz w:val="18"/>
+              </w:rPr>
+              <w:t>n/a</w:t>
+            </w:r>
+          </w:p>
+        </w:tc>
+      </w:tr>
+    </w:tbl>
+    <w:p/>
+    <w:p>
+      <w:pPr>
+        <w:pStyle w:val="Heading1"/>
+      </w:pPr>
+      <w:r>
+        <w:t>Appendix B: Per-participant verification against the .dta (controller script, seam path)</w:t>
       </w:r>
     </w:p>
     <w:p>
@@ -19874,6 +22080,9 @@
             <w:tcW w:type="dxa" w:w="2484"/>
           </w:tcPr>
           <w:p>
+            <w:pPr>
+              <w:keepNext/>
+            </w:pPr>
             <w:r/>
             <w:r>
               <w:rPr>
@@ -19889,6 +22098,9 @@
             <w:tcW w:type="dxa" w:w="2484"/>
           </w:tcPr>
           <w:p>
+            <w:pPr>
+              <w:keepNext/>
+            </w:pPr>
             <w:r/>
             <w:r>
               <w:rPr>
@@ -19904,6 +22116,9 @@
             <w:tcW w:type="dxa" w:w="2484"/>
           </w:tcPr>
           <w:p>
+            <w:pPr>
+              <w:keepNext/>
+            </w:pPr>
             <w:r/>
             <w:r>
               <w:rPr>
@@ -19919,6 +22134,9 @@
             <w:tcW w:type="dxa" w:w="2484"/>
           </w:tcPr>
           <w:p>
+            <w:pPr>
+              <w:keepNext/>
+            </w:pPr>
             <w:r/>
             <w:r>
               <w:rPr>
@@ -19939,6 +22157,9 @@
             <w:tcW w:type="dxa" w:w="2484"/>
           </w:tcPr>
           <w:p>
+            <w:pPr>
+              <w:keepNext/>
+            </w:pPr>
             <w:r/>
             <w:r>
               <w:rPr>
@@ -19953,6 +22174,9 @@
             <w:tcW w:type="dxa" w:w="2484"/>
           </w:tcPr>
           <w:p>
+            <w:pPr>
+              <w:keepNext/>
+            </w:pPr>
             <w:r/>
             <w:r>
               <w:rPr>
@@ -19967,6 +22191,9 @@
             <w:tcW w:type="dxa" w:w="2484"/>
           </w:tcPr>
           <w:p>
+            <w:pPr>
+              <w:keepNext/>
+            </w:pPr>
             <w:r/>
             <w:r>
               <w:rPr>
@@ -19981,6 +22208,9 @@
             <w:tcW w:type="dxa" w:w="2484"/>
           </w:tcPr>
           <w:p>
+            <w:pPr>
+              <w:keepNext/>
+            </w:pPr>
             <w:r/>
             <w:r>
               <w:rPr>
@@ -20000,6 +22230,9 @@
             <w:tcW w:type="dxa" w:w="2484"/>
           </w:tcPr>
           <w:p>
+            <w:pPr>
+              <w:keepNext/>
+            </w:pPr>
             <w:r/>
             <w:r>
               <w:rPr>
@@ -20014,6 +22247,9 @@
             <w:tcW w:type="dxa" w:w="2484"/>
           </w:tcPr>
           <w:p>
+            <w:pPr>
+              <w:keepNext/>
+            </w:pPr>
             <w:r/>
             <w:r>
               <w:rPr>
@@ -20028,6 +22264,9 @@
             <w:tcW w:type="dxa" w:w="2484"/>
           </w:tcPr>
           <w:p>
+            <w:pPr>
+              <w:keepNext/>
+            </w:pPr>
             <w:r/>
             <w:r>
               <w:rPr>
@@ -20042,6 +22281,9 @@
             <w:tcW w:type="dxa" w:w="2484"/>
           </w:tcPr>
           <w:p>
+            <w:pPr>
+              <w:keepNext/>
+            </w:pPr>
             <w:r/>
             <w:r>
               <w:rPr>
@@ -20061,6 +22303,9 @@
             <w:tcW w:type="dxa" w:w="2484"/>
           </w:tcPr>
           <w:p>
+            <w:pPr>
+              <w:keepNext/>
+            </w:pPr>
             <w:r/>
             <w:r>
               <w:rPr>
@@ -20075,6 +22320,9 @@
             <w:tcW w:type="dxa" w:w="2484"/>
           </w:tcPr>
           <w:p>
+            <w:pPr>
+              <w:keepNext/>
+            </w:pPr>
             <w:r/>
             <w:r>
               <w:rPr>
@@ -20089,6 +22337,9 @@
             <w:tcW w:type="dxa" w:w="2484"/>
           </w:tcPr>
           <w:p>
+            <w:pPr>
+              <w:keepNext/>
+            </w:pPr>
             <w:r/>
             <w:r>
               <w:rPr>
@@ -20103,6 +22354,9 @@
             <w:tcW w:type="dxa" w:w="2484"/>
           </w:tcPr>
           <w:p>
+            <w:pPr>
+              <w:keepNext/>
+            </w:pPr>
             <w:r/>
             <w:r>
               <w:rPr>
@@ -20122,6 +22376,9 @@
             <w:tcW w:type="dxa" w:w="2484"/>
           </w:tcPr>
           <w:p>
+            <w:pPr>
+              <w:keepNext/>
+            </w:pPr>
             <w:r/>
             <w:r>
               <w:rPr>
@@ -20136,6 +22393,9 @@
             <w:tcW w:type="dxa" w:w="2484"/>
           </w:tcPr>
           <w:p>
+            <w:pPr>
+              <w:keepNext/>
+            </w:pPr>
             <w:r/>
             <w:r>
               <w:rPr>
@@ -20150,6 +22410,9 @@
             <w:tcW w:type="dxa" w:w="2484"/>
           </w:tcPr>
           <w:p>
+            <w:pPr>
+              <w:keepNext/>
+            </w:pPr>
             <w:r/>
             <w:r>
               <w:rPr>
@@ -20164,6 +22427,9 @@
             <w:tcW w:type="dxa" w:w="2484"/>
           </w:tcPr>
           <w:p>
+            <w:pPr>
+              <w:keepNext/>
+            </w:pPr>
             <w:r/>
             <w:r>
               <w:rPr>
@@ -20183,6 +22449,9 @@
             <w:tcW w:type="dxa" w:w="2484"/>
           </w:tcPr>
           <w:p>
+            <w:pPr>
+              <w:keepNext/>
+            </w:pPr>
             <w:r/>
             <w:r>
               <w:rPr>
@@ -20197,6 +22466,9 @@
             <w:tcW w:type="dxa" w:w="2484"/>
           </w:tcPr>
           <w:p>
+            <w:pPr>
+              <w:keepNext/>
+            </w:pPr>
             <w:r/>
             <w:r>
               <w:rPr>
@@ -20211,6 +22483,9 @@
             <w:tcW w:type="dxa" w:w="2484"/>
           </w:tcPr>
           <w:p>
+            <w:pPr>
+              <w:keepNext/>
+            </w:pPr>
             <w:r/>
             <w:r>
               <w:rPr>
@@ -20225,6 +22500,9 @@
             <w:tcW w:type="dxa" w:w="2484"/>
           </w:tcPr>
           <w:p>
+            <w:pPr>
+              <w:keepNext/>
+            </w:pPr>
             <w:r/>
             <w:r>
               <w:rPr>
@@ -20244,6 +22522,9 @@
             <w:tcW w:type="dxa" w:w="2484"/>
           </w:tcPr>
           <w:p>
+            <w:pPr>
+              <w:keepNext/>
+            </w:pPr>
             <w:r/>
             <w:r>
               <w:rPr>
@@ -20258,6 +22539,9 @@
             <w:tcW w:type="dxa" w:w="2484"/>
           </w:tcPr>
           <w:p>
+            <w:pPr>
+              <w:keepNext/>
+            </w:pPr>
             <w:r/>
             <w:r>
               <w:rPr>
@@ -20272,6 +22556,9 @@
             <w:tcW w:type="dxa" w:w="2484"/>
           </w:tcPr>
           <w:p>
+            <w:pPr>
+              <w:keepNext/>
+            </w:pPr>
             <w:r/>
             <w:r>
               <w:rPr>
@@ -20286,6 +22573,9 @@
             <w:tcW w:type="dxa" w:w="2484"/>
           </w:tcPr>
           <w:p>
+            <w:pPr>
+              <w:keepNext/>
+            </w:pPr>
             <w:r/>
             <w:r>
               <w:rPr>
@@ -20305,6 +22595,9 @@
             <w:tcW w:type="dxa" w:w="2484"/>
           </w:tcPr>
           <w:p>
+            <w:pPr>
+              <w:keepNext/>
+            </w:pPr>
             <w:r/>
             <w:r>
               <w:rPr>
@@ -20319,6 +22612,9 @@
             <w:tcW w:type="dxa" w:w="2484"/>
           </w:tcPr>
           <w:p>
+            <w:pPr>
+              <w:keepNext/>
+            </w:pPr>
             <w:r/>
             <w:r>
               <w:rPr>
@@ -20333,6 +22629,9 @@
             <w:tcW w:type="dxa" w:w="2484"/>
           </w:tcPr>
           <w:p>
+            <w:pPr>
+              <w:keepNext/>
+            </w:pPr>
             <w:r/>
             <w:r>
               <w:rPr>
@@ -20347,6 +22646,9 @@
             <w:tcW w:type="dxa" w:w="2484"/>
           </w:tcPr>
           <w:p>
+            <w:pPr>
+              <w:keepNext/>
+            </w:pPr>
             <w:r/>
             <w:r>
               <w:rPr>
@@ -20366,6 +22668,9 @@
             <w:tcW w:type="dxa" w:w="2484"/>
           </w:tcPr>
           <w:p>
+            <w:pPr>
+              <w:keepNext/>
+            </w:pPr>
             <w:r/>
             <w:r>
               <w:rPr>
@@ -20380,6 +22685,9 @@
             <w:tcW w:type="dxa" w:w="2484"/>
           </w:tcPr>
           <w:p>
+            <w:pPr>
+              <w:keepNext/>
+            </w:pPr>
             <w:r/>
             <w:r>
               <w:rPr>
@@ -20394,6 +22702,9 @@
             <w:tcW w:type="dxa" w:w="2484"/>
           </w:tcPr>
           <w:p>
+            <w:pPr>
+              <w:keepNext/>
+            </w:pPr>
             <w:r/>
             <w:r>
               <w:rPr>
@@ -20408,6 +22719,9 @@
             <w:tcW w:type="dxa" w:w="2484"/>
           </w:tcPr>
           <w:p>
+            <w:pPr>
+              <w:keepNext/>
+            </w:pPr>
             <w:r/>
             <w:r>
               <w:rPr>
@@ -20427,6 +22741,9 @@
             <w:tcW w:type="dxa" w:w="2484"/>
           </w:tcPr>
           <w:p>
+            <w:pPr>
+              <w:keepNext/>
+            </w:pPr>
             <w:r/>
             <w:r>
               <w:rPr>
@@ -20441,6 +22758,9 @@
             <w:tcW w:type="dxa" w:w="2484"/>
           </w:tcPr>
           <w:p>
+            <w:pPr>
+              <w:keepNext/>
+            </w:pPr>
             <w:r/>
             <w:r>
               <w:rPr>
@@ -20455,6 +22775,9 @@
             <w:tcW w:type="dxa" w:w="2484"/>
           </w:tcPr>
           <w:p>
+            <w:pPr>
+              <w:keepNext/>
+            </w:pPr>
             <w:r/>
             <w:r>
               <w:rPr>
@@ -20469,6 +22792,9 @@
             <w:tcW w:type="dxa" w:w="2484"/>
           </w:tcPr>
           <w:p>
+            <w:pPr>
+              <w:keepNext/>
+            </w:pPr>
             <w:r/>
             <w:r>
               <w:rPr>
@@ -20488,6 +22814,9 @@
             <w:tcW w:type="dxa" w:w="2484"/>
           </w:tcPr>
           <w:p>
+            <w:pPr>
+              <w:keepNext/>
+            </w:pPr>
             <w:r/>
             <w:r>
               <w:rPr>
@@ -20502,6 +22831,9 @@
             <w:tcW w:type="dxa" w:w="2484"/>
           </w:tcPr>
           <w:p>
+            <w:pPr>
+              <w:keepNext/>
+            </w:pPr>
             <w:r/>
             <w:r>
               <w:rPr>
@@ -20516,6 +22848,9 @@
             <w:tcW w:type="dxa" w:w="2484"/>
           </w:tcPr>
           <w:p>
+            <w:pPr>
+              <w:keepNext/>
+            </w:pPr>
             <w:r/>
             <w:r>
               <w:rPr>
@@ -20530,6 +22865,9 @@
             <w:tcW w:type="dxa" w:w="2484"/>
           </w:tcPr>
           <w:p>
+            <w:pPr>
+              <w:keepNext/>
+            </w:pPr>
             <w:r/>
             <w:r>
               <w:rPr>
@@ -20549,6 +22887,9 @@
             <w:tcW w:type="dxa" w:w="2484"/>
           </w:tcPr>
           <w:p>
+            <w:pPr>
+              <w:keepNext/>
+            </w:pPr>
             <w:r/>
             <w:r>
               <w:rPr>
@@ -20563,6 +22904,9 @@
             <w:tcW w:type="dxa" w:w="2484"/>
           </w:tcPr>
           <w:p>
+            <w:pPr>
+              <w:keepNext/>
+            </w:pPr>
             <w:r/>
             <w:r>
               <w:rPr>
@@ -20577,6 +22921,9 @@
             <w:tcW w:type="dxa" w:w="2484"/>
           </w:tcPr>
           <w:p>
+            <w:pPr>
+              <w:keepNext/>
+            </w:pPr>
             <w:r/>
             <w:r>
               <w:rPr>
@@ -20591,6 +22938,9 @@
             <w:tcW w:type="dxa" w:w="2484"/>
           </w:tcPr>
           <w:p>
+            <w:pPr>
+              <w:keepNext/>
+            </w:pPr>
             <w:r/>
             <w:r>
               <w:rPr>
@@ -20610,6 +22960,9 @@
             <w:tcW w:type="dxa" w:w="2484"/>
           </w:tcPr>
           <w:p>
+            <w:pPr>
+              <w:keepNext/>
+            </w:pPr>
             <w:r/>
             <w:r>
               <w:rPr>
@@ -20624,6 +22977,9 @@
             <w:tcW w:type="dxa" w:w="2484"/>
           </w:tcPr>
           <w:p>
+            <w:pPr>
+              <w:keepNext/>
+            </w:pPr>
             <w:r/>
             <w:r>
               <w:rPr>
@@ -20638,6 +22994,9 @@
             <w:tcW w:type="dxa" w:w="2484"/>
           </w:tcPr>
           <w:p>
+            <w:pPr>
+              <w:keepNext/>
+            </w:pPr>
             <w:r/>
             <w:r>
               <w:rPr>
@@ -20652,6 +23011,9 @@
             <w:tcW w:type="dxa" w:w="2484"/>
           </w:tcPr>
           <w:p>
+            <w:pPr>
+              <w:keepNext/>
+            </w:pPr>
             <w:r/>
             <w:r>
               <w:rPr>
@@ -20671,6 +23033,9 @@
             <w:tcW w:type="dxa" w:w="2484"/>
           </w:tcPr>
           <w:p>
+            <w:pPr>
+              <w:keepNext/>
+            </w:pPr>
             <w:r/>
             <w:r>
               <w:rPr>
@@ -20685,6 +23050,9 @@
             <w:tcW w:type="dxa" w:w="2484"/>
           </w:tcPr>
           <w:p>
+            <w:pPr>
+              <w:keepNext/>
+            </w:pPr>
             <w:r/>
             <w:r>
               <w:rPr>
@@ -20699,6 +23067,9 @@
             <w:tcW w:type="dxa" w:w="2484"/>
           </w:tcPr>
           <w:p>
+            <w:pPr>
+              <w:keepNext/>
+            </w:pPr>
             <w:r/>
             <w:r>
               <w:rPr>
@@ -20713,6 +23084,9 @@
             <w:tcW w:type="dxa" w:w="2484"/>
           </w:tcPr>
           <w:p>
+            <w:pPr>
+              <w:keepNext/>
+            </w:pPr>
             <w:r/>
             <w:r>
               <w:rPr>
@@ -20732,6 +23106,9 @@
             <w:tcW w:type="dxa" w:w="2484"/>
           </w:tcPr>
           <w:p>
+            <w:pPr>
+              <w:keepNext/>
+            </w:pPr>
             <w:r/>
             <w:r>
               <w:rPr>
@@ -20746,6 +23123,9 @@
             <w:tcW w:type="dxa" w:w="2484"/>
           </w:tcPr>
           <w:p>
+            <w:pPr>
+              <w:keepNext/>
+            </w:pPr>
             <w:r/>
             <w:r>
               <w:rPr>
@@ -20760,6 +23140,9 @@
             <w:tcW w:type="dxa" w:w="2484"/>
           </w:tcPr>
           <w:p>
+            <w:pPr>
+              <w:keepNext/>
+            </w:pPr>
             <w:r/>
             <w:r>
               <w:rPr>
@@ -20774,6 +23157,9 @@
             <w:tcW w:type="dxa" w:w="2484"/>
           </w:tcPr>
           <w:p>
+            <w:pPr>
+              <w:keepNext/>
+            </w:pPr>
             <w:r/>
             <w:r>
               <w:rPr>
@@ -20793,6 +23179,9 @@
             <w:tcW w:type="dxa" w:w="2484"/>
           </w:tcPr>
           <w:p>
+            <w:pPr>
+              <w:keepNext/>
+            </w:pPr>
             <w:r/>
             <w:r>
               <w:rPr>
@@ -20807,6 +23196,9 @@
             <w:tcW w:type="dxa" w:w="2484"/>
           </w:tcPr>
           <w:p>
+            <w:pPr>
+              <w:keepNext/>
+            </w:pPr>
             <w:r/>
             <w:r>
               <w:rPr>
@@ -20821,6 +23213,9 @@
             <w:tcW w:type="dxa" w:w="2484"/>
           </w:tcPr>
           <w:p>
+            <w:pPr>
+              <w:keepNext/>
+            </w:pPr>
             <w:r/>
             <w:r>
               <w:rPr>
@@ -20835,6 +23230,9 @@
             <w:tcW w:type="dxa" w:w="2484"/>
           </w:tcPr>
           <w:p>
+            <w:pPr>
+              <w:keepNext/>
+            </w:pPr>
             <w:r/>
             <w:r>
               <w:rPr>
@@ -20854,6 +23252,9 @@
             <w:tcW w:type="dxa" w:w="2484"/>
           </w:tcPr>
           <w:p>
+            <w:pPr>
+              <w:keepNext/>
+            </w:pPr>
             <w:r/>
             <w:r>
               <w:rPr>
@@ -20868,6 +23269,9 @@
             <w:tcW w:type="dxa" w:w="2484"/>
           </w:tcPr>
           <w:p>
+            <w:pPr>
+              <w:keepNext/>
+            </w:pPr>
             <w:r/>
             <w:r>
               <w:rPr>
@@ -20882,6 +23286,9 @@
             <w:tcW w:type="dxa" w:w="2484"/>
           </w:tcPr>
           <w:p>
+            <w:pPr>
+              <w:keepNext/>
+            </w:pPr>
             <w:r/>
             <w:r>
               <w:rPr>
@@ -20896,6 +23303,9 @@
             <w:tcW w:type="dxa" w:w="2484"/>
           </w:tcPr>
           <w:p>
+            <w:pPr>
+              <w:keepNext/>
+            </w:pPr>
             <w:r/>
             <w:r>
               <w:rPr>
@@ -20915,6 +23325,9 @@
             <w:tcW w:type="dxa" w:w="2484"/>
           </w:tcPr>
           <w:p>
+            <w:pPr>
+              <w:keepNext/>
+            </w:pPr>
             <w:r/>
             <w:r>
               <w:rPr>
@@ -20929,6 +23342,9 @@
             <w:tcW w:type="dxa" w:w="2484"/>
           </w:tcPr>
           <w:p>
+            <w:pPr>
+              <w:keepNext/>
+            </w:pPr>
             <w:r/>
             <w:r>
               <w:rPr>
@@ -20943,6 +23359,9 @@
             <w:tcW w:type="dxa" w:w="2484"/>
           </w:tcPr>
           <w:p>
+            <w:pPr>
+              <w:keepNext/>
+            </w:pPr>
             <w:r/>
             <w:r>
               <w:rPr>
@@ -20957,6 +23376,9 @@
             <w:tcW w:type="dxa" w:w="2484"/>
           </w:tcPr>
           <w:p>
+            <w:pPr>
+              <w:keepNext/>
+            </w:pPr>
             <w:r/>
             <w:r>
               <w:rPr>
@@ -20976,6 +23398,9 @@
             <w:tcW w:type="dxa" w:w="2484"/>
           </w:tcPr>
           <w:p>
+            <w:pPr>
+              <w:keepNext/>
+            </w:pPr>
             <w:r/>
             <w:r>
               <w:rPr>
@@ -20990,6 +23415,9 @@
             <w:tcW w:type="dxa" w:w="2484"/>
           </w:tcPr>
           <w:p>
+            <w:pPr>
+              <w:keepNext/>
+            </w:pPr>
             <w:r/>
             <w:r>
               <w:rPr>
@@ -21004,6 +23432,9 @@
             <w:tcW w:type="dxa" w:w="2484"/>
           </w:tcPr>
           <w:p>
+            <w:pPr>
+              <w:keepNext/>
+            </w:pPr>
             <w:r/>
             <w:r>
               <w:rPr>
@@ -21018,6 +23449,9 @@
             <w:tcW w:type="dxa" w:w="2484"/>
           </w:tcPr>
           <w:p>
+            <w:pPr>
+              <w:keepNext/>
+            </w:pPr>
             <w:r/>
             <w:r>
               <w:rPr>
@@ -21037,6 +23471,9 @@
             <w:tcW w:type="dxa" w:w="2484"/>
           </w:tcPr>
           <w:p>
+            <w:pPr>
+              <w:keepNext/>
+            </w:pPr>
             <w:r/>
             <w:r>
               <w:rPr>
@@ -21051,6 +23488,9 @@
             <w:tcW w:type="dxa" w:w="2484"/>
           </w:tcPr>
           <w:p>
+            <w:pPr>
+              <w:keepNext/>
+            </w:pPr>
             <w:r/>
             <w:r>
               <w:rPr>
@@ -21065,6 +23505,9 @@
             <w:tcW w:type="dxa" w:w="2484"/>
           </w:tcPr>
           <w:p>
+            <w:pPr>
+              <w:keepNext/>
+            </w:pPr>
             <w:r/>
             <w:r>
               <w:rPr>
@@ -21079,6 +23522,9 @@
             <w:tcW w:type="dxa" w:w="2484"/>
           </w:tcPr>
           <w:p>
+            <w:pPr>
+              <w:keepNext/>
+            </w:pPr>
             <w:r/>
             <w:r>
               <w:rPr>
@@ -21157,7 +23603,7 @@
         <w:pStyle w:val="Heading1"/>
       </w:pPr>
       <w:r>
-        <w:t>Appendix B: Document / data errors found</w:t>
+        <w:t>Appendix C: Document / data errors found</w:t>
       </w:r>
     </w:p>
     <w:p>
@@ -21166,6 +23612,14 @@
       </w:pPr>
       <w:r>
         <w:t>The stored column weighted_WTP_categorical in Stata_File_Decision4_050926.dta (and therefore z_WTP_categorical and figure F7) was produced with a superseded formula (see step 6); the document's printed cond() code is what the app implements.</w:t>
+      </w:r>
+    </w:p>
+    <w:p>
+      <w:pPr>
+        <w:pStyle w:val="ListBullet"/>
+      </w:pPr>
+      <w:r>
+        <w:t>The document's histograms use Stata's default bin count, which TRUNCATES min(√N, 10·log10 N) = 16.73 to 16 bins at N = 280 (verified bar by bar on all eleven continuous figures). The app rounded to 17 bins until HEAD e41968d; the earlier revision of this comparison stated "identical 17-bin histograms" on the basis of summary statistics, which was wrong.</w:t>
       </w:r>
     </w:p>
     <w:p>

</xml_diff>